<commit_message>
Inject tags into docx files for manual format editing
</commit_message>
<xml_diff>
--- a/public/1. Phiếu Lý lịch học viên.docx
+++ b/public/1. Phiếu Lý lịch học viên.docx
@@ -1,6 +1,6 @@
 
 <file path=word/document.xml><?xml version="1.0" encoding="utf-8"?>
-<w:document xmlns:ns1="http://schemas.openxmlformats.org/markup-compatibility/2006" xmlns:ns2="http://schemas.openxmlformats.org/drawingml/2006/wordprocessingDrawing" xmlns:ns3="http://schemas.microsoft.com/office/word/2010/wordprocessingDrawing" xmlns:ns4="http://schemas.openxmlformats.org/drawingml/2006/main" xmlns:ns5="http://schemas.microsoft.com/office/word/2010/wordprocessingShape" xmlns:ns6="urn:schemas-microsoft-com:vml" xmlns:ns7="http://schemas.microsoft.com/office/word/2010/wordml" xmlns:ns8="urn:schemas-microsoft-com:office:office" xmlns:ns9="http://schemas.openxmlformats.org/officeDocument/2006/relationships" xmlns:w="http://schemas.openxmlformats.org/wordprocessingml/2006/main" ns1:Ignorable="w14 w15 w16se wp14">
+<w:document xmlns:wpc="http://schemas.microsoft.com/office/word/2010/wordprocessingCanvas" xmlns:cx="http://schemas.microsoft.com/office/drawing/2014/chartex" xmlns:mc="http://schemas.openxmlformats.org/markup-compatibility/2006" xmlns:o="urn:schemas-microsoft-com:office:office" xmlns:r="http://schemas.openxmlformats.org/officeDocument/2006/relationships" xmlns:m="http://schemas.openxmlformats.org/officeDocument/2006/math" xmlns:v="urn:schemas-microsoft-com:vml" xmlns:wp14="http://schemas.microsoft.com/office/word/2010/wordprocessingDrawing" xmlns:wp="http://schemas.openxmlformats.org/drawingml/2006/wordprocessingDrawing" xmlns:w10="urn:schemas-microsoft-com:office:word" xmlns:w="http://schemas.openxmlformats.org/wordprocessingml/2006/main" xmlns:w14="http://schemas.microsoft.com/office/word/2010/wordml" xmlns:w15="http://schemas.microsoft.com/office/word/2012/wordml" xmlns:w16se="http://schemas.microsoft.com/office/word/2015/wordml/symex" xmlns:wpg="http://schemas.microsoft.com/office/word/2010/wordprocessingGroup" xmlns:wpi="http://schemas.microsoft.com/office/word/2010/wordprocessingInk" xmlns:wne="http://schemas.microsoft.com/office/word/2006/wordml" xmlns:wps="http://schemas.microsoft.com/office/word/2010/wordprocessingShape" mc:Ignorable="w14 w15 w16se wp14">
   <w:body>
     <w:tbl>
       <w:tblPr>
@@ -197,73 +197,73 @@
                 <w:sz w:val="26"/>
                 <w:szCs w:val="26"/>
               </w:rPr>
-              <ns1:AlternateContent>
-                <ns1:Choice Requires="wps">
+              <mc:AlternateContent>
+                <mc:Choice Requires="wps">
                   <w:drawing>
-                    <ns2:anchor distT="0" distB="0" distL="114300" distR="114300" simplePos="0" relativeHeight="251675136" behindDoc="0" locked="0" layoutInCell="1" allowOverlap="1" ns3:anchorId="44469BD0" ns3:editId="63D4596B">
-                      <ns2:simplePos x="0" y="0"/>
-                      <ns2:positionH relativeFrom="column">
-                        <ns2:posOffset>979805</ns2:posOffset>
-                      </ns2:positionH>
-                      <ns2:positionV relativeFrom="paragraph">
-                        <ns2:posOffset>178435</ns2:posOffset>
-                      </ns2:positionV>
-                      <ns2:extent cx="1571625" cy="0"/>
-                      <ns2:effectExtent l="0" t="0" r="0" b="0"/>
-                      <ns2:wrapNone/>
-                      <ns2:docPr id="1" name="Đường kết nối Thẳng 1"/>
-                      <ns2:cNvGraphicFramePr/>
-                      <ns4:graphic>
-                        <ns4:graphicData uri="http://schemas.microsoft.com/office/word/2010/wordprocessingShape">
-                          <ns5:wsp>
-                            <ns5:cNvCnPr/>
-                            <ns5:spPr>
-                              <ns4:xfrm>
-                                <ns4:off x="0" y="0"/>
-                                <ns4:ext cx="1571625" cy="0"/>
-                              </ns4:xfrm>
-                              <ns4:prstGeom prst="line">
-                                <ns4:avLst/>
-                              </ns4:prstGeom>
-                              <ns4:ln>
-                                <ns4:solidFill>
-                                  <ns4:schemeClr val="tx1"/>
-                                </ns4:solidFill>
-                              </ns4:ln>
-                            </ns5:spPr>
-                            <ns5:style>
-                              <ns4:lnRef idx="1">
-                                <ns4:schemeClr val="accent1"/>
-                              </ns4:lnRef>
-                              <ns4:fillRef idx="0">
-                                <ns4:schemeClr val="accent1"/>
-                              </ns4:fillRef>
-                              <ns4:effectRef idx="0">
-                                <ns4:schemeClr val="accent1"/>
-                              </ns4:effectRef>
-                              <ns4:fontRef idx="minor">
-                                <ns4:schemeClr val="tx1"/>
-                              </ns4:fontRef>
-                            </ns5:style>
-                            <ns5:bodyPr/>
-                          </ns5:wsp>
-                        </ns4:graphicData>
-                      </ns4:graphic>
-                      <ns3:sizeRelH relativeFrom="margin">
-                        <ns3:pctWidth>0</ns3:pctWidth>
-                      </ns3:sizeRelH>
-                      <ns3:sizeRelV relativeFrom="margin">
-                        <ns3:pctHeight>0</ns3:pctHeight>
-                      </ns3:sizeRelV>
-                    </ns2:anchor>
+                    <wp:anchor distT="0" distB="0" distL="114300" distR="114300" simplePos="0" relativeHeight="251675136" behindDoc="0" locked="0" layoutInCell="1" allowOverlap="1" wp14:anchorId="44469BD0" wp14:editId="63D4596B">
+                      <wp:simplePos x="0" y="0"/>
+                      <wp:positionH relativeFrom="column">
+                        <wp:posOffset>979805</wp:posOffset>
+                      </wp:positionH>
+                      <wp:positionV relativeFrom="paragraph">
+                        <wp:posOffset>178435</wp:posOffset>
+                      </wp:positionV>
+                      <wp:extent cx="1571625" cy="0"/>
+                      <wp:effectExtent l="0" t="0" r="0" b="0"/>
+                      <wp:wrapNone/>
+                      <wp:docPr id="1" name="Đường kết nối Thẳng 1"/>
+                      <wp:cNvGraphicFramePr/>
+                      <a:graphic xmlns:a="http://schemas.openxmlformats.org/drawingml/2006/main">
+                        <a:graphicData uri="http://schemas.microsoft.com/office/word/2010/wordprocessingShape">
+                          <wps:wsp>
+                            <wps:cNvCnPr/>
+                            <wps:spPr>
+                              <a:xfrm>
+                                <a:off x="0" y="0"/>
+                                <a:ext cx="1571625" cy="0"/>
+                              </a:xfrm>
+                              <a:prstGeom prst="line">
+                                <a:avLst/>
+                              </a:prstGeom>
+                              <a:ln>
+                                <a:solidFill>
+                                  <a:schemeClr val="tx1"/>
+                                </a:solidFill>
+                              </a:ln>
+                            </wps:spPr>
+                            <wps:style>
+                              <a:lnRef idx="1">
+                                <a:schemeClr val="accent1"/>
+                              </a:lnRef>
+                              <a:fillRef idx="0">
+                                <a:schemeClr val="accent1"/>
+                              </a:fillRef>
+                              <a:effectRef idx="0">
+                                <a:schemeClr val="accent1"/>
+                              </a:effectRef>
+                              <a:fontRef idx="minor">
+                                <a:schemeClr val="tx1"/>
+                              </a:fontRef>
+                            </wps:style>
+                            <wps:bodyPr/>
+                          </wps:wsp>
+                        </a:graphicData>
+                      </a:graphic>
+                      <wp14:sizeRelH relativeFrom="margin">
+                        <wp14:pctWidth>0</wp14:pctWidth>
+                      </wp14:sizeRelH>
+                      <wp14:sizeRelV relativeFrom="margin">
+                        <wp14:pctHeight>0</wp14:pctHeight>
+                      </wp14:sizeRelV>
+                    </wp:anchor>
                   </w:drawing>
-                </ns1:Choice>
-                <ns1:Fallback>
+                </mc:Choice>
+                <mc:Fallback>
                   <w:pict>
-                    <ns6:line ns7:anchorId="229A6544" id="Đường kết nối Thẳng 1" ns8:spid="_x0000_s1026" style="position:absolute;z-index:251675136;visibility:visible;mso-wrap-style:square;mso-width-percent:0;mso-height-percent:0;mso-wrap-distance-left:9pt;mso-wrap-distance-top:0;mso-wrap-distance-right:9pt;mso-wrap-distance-bottom:0;mso-position-horizontal:absolute;mso-position-horizontal-relative:text;mso-position-vertical:absolute;mso-position-vertical-relative:text;mso-width-percent:0;mso-height-percent:0;mso-width-relative:margin;mso-height-relative:margin" from="77.15pt,14.05pt" to="200.9pt,14.05pt" ns8:gfxdata="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" strokecolor="black [3213]"/>
+                    <v:line w14:anchorId="229A6544" id="Đường kết nối Thẳng 1" o:spid="_x0000_s1026" style="position:absolute;z-index:251675136;visibility:visible;mso-wrap-style:square;mso-width-percent:0;mso-height-percent:0;mso-wrap-distance-left:9pt;mso-wrap-distance-top:0;mso-wrap-distance-right:9pt;mso-wrap-distance-bottom:0;mso-position-horizontal:absolute;mso-position-horizontal-relative:text;mso-position-vertical:absolute;mso-position-vertical-relative:text;mso-width-percent:0;mso-height-percent:0;mso-width-relative:margin;mso-height-relative:margin" from="77.15pt,14.05pt" to="200.9pt,14.05pt" o:gfxdata="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" strokecolor="black [3213]"/>
                   </w:pict>
-                </ns1:Fallback>
-              </ns1:AlternateContent>
+                </mc:Fallback>
+              </mc:AlternateContent>
             </w:r>
             <w:r>
               <w:rPr>
@@ -304,8 +304,59 @@
             <w:r>
               <w:rPr>
                 <w:rFonts w:ascii="Times New Roman" w:hAnsi="Times New Roman"/>
-              </w:rPr>
-              <w:t xml:space="preserve">Lớp: {className}</w:t>
+                <w:bCs/>
+                <w:color w:val="000000"/>
+                <w:spacing w:val="10"/>
+                <w:sz w:val="24"/>
+                <w:szCs w:val="24"/>
+              </w:rPr>
+              <w:t xml:space="preserve">                                                                         </w:t>
+            </w:r>
+            <w:r>
+              <w:rPr>
+                <w:rFonts w:ascii="Times New Roman" w:hAnsi="Times New Roman"/>
+                <w:bCs/>
+                <w:color w:val="000000"/>
+                <w:spacing w:val="10"/>
+                <w:sz w:val="24"/>
+                <w:szCs w:val="24"/>
+                <w:lang w:val="vi-VN"/>
+              </w:rPr>
+              <w:t>Lớp:……………</w:t>
+            </w:r>
+            <w:r>
+              <w:rPr>
+                <w:rFonts w:ascii="Times New Roman" w:hAnsi="Times New Roman"/>
+                <w:bCs/>
+                <w:color w:val="000000"/>
+                <w:spacing w:val="10"/>
+                <w:sz w:val="24"/>
+                <w:szCs w:val="24"/>
+              </w:rPr>
+              <w:t>…..</w:t>
+            </w:r>
+            <w:r>
+              <w:rPr>
+                <w:rFonts w:ascii="Times New Roman" w:hAnsi="Times New Roman"/>
+                <w:bCs/>
+                <w:color w:val="000000"/>
+                <w:spacing w:val="10"/>
+                <w:sz w:val="24"/>
+                <w:szCs w:val="24"/>
+                <w:lang w:val="vi-VN"/>
+              </w:rPr>
+              <w:t>……</w:t>
+            </w:r>
+            <w:r>
+              <w:rPr>
+                <w:rFonts w:ascii="Times New Roman" w:hAnsi="Times New Roman"/>
+                <w:bCs/>
+                <w:color w:val="000000"/>
+                <w:spacing w:val="10"/>
+                <w:sz w:val="24"/>
+                <w:szCs w:val="24"/>
+              </w:rPr>
+              <w:t>……</w:t>
             </w:r>
           </w:p>
           <w:p>
@@ -323,8 +374,59 @@
             <w:r>
               <w:rPr>
                 <w:rFonts w:ascii="Times New Roman" w:hAnsi="Times New Roman"/>
-              </w:rPr>
-              <w:t xml:space="preserve">Ngành: {major}</w:t>
+                <w:bCs/>
+                <w:color w:val="000000"/>
+                <w:spacing w:val="10"/>
+                <w:sz w:val="24"/>
+                <w:szCs w:val="24"/>
+              </w:rPr>
+              <w:t xml:space="preserve">                                                                         </w:t>
+            </w:r>
+            <w:r>
+              <w:rPr>
+                <w:rFonts w:ascii="Times New Roman" w:hAnsi="Times New Roman"/>
+                <w:bCs/>
+                <w:color w:val="000000"/>
+                <w:spacing w:val="10"/>
+                <w:sz w:val="24"/>
+                <w:szCs w:val="24"/>
+                <w:lang w:val="vi-VN"/>
+              </w:rPr>
+              <w:t>Ngành:……………</w:t>
+            </w:r>
+            <w:r>
+              <w:rPr>
+                <w:rFonts w:ascii="Times New Roman" w:hAnsi="Times New Roman"/>
+                <w:bCs/>
+                <w:color w:val="000000"/>
+                <w:spacing w:val="10"/>
+                <w:sz w:val="24"/>
+                <w:szCs w:val="24"/>
+              </w:rPr>
+              <w:t>…..</w:t>
+            </w:r>
+            <w:r>
+              <w:rPr>
+                <w:rFonts w:ascii="Times New Roman" w:hAnsi="Times New Roman"/>
+                <w:bCs/>
+                <w:color w:val="000000"/>
+                <w:spacing w:val="10"/>
+                <w:sz w:val="24"/>
+                <w:szCs w:val="24"/>
+                <w:lang w:val="vi-VN"/>
+              </w:rPr>
+              <w:t>..…</w:t>
+            </w:r>
+            <w:r>
+              <w:rPr>
+                <w:rFonts w:ascii="Times New Roman" w:hAnsi="Times New Roman"/>
+                <w:bCs/>
+                <w:color w:val="000000"/>
+                <w:spacing w:val="10"/>
+                <w:sz w:val="24"/>
+                <w:szCs w:val="24"/>
+              </w:rPr>
+              <w:t>…</w:t>
             </w:r>
           </w:p>
         </w:tc>
@@ -381,73 +483,73 @@
                 <w:sz w:val="26"/>
                 <w:szCs w:val="26"/>
               </w:rPr>
-              <ns1:AlternateContent>
-                <ns1:Choice Requires="wps">
+              <mc:AlternateContent>
+                <mc:Choice Requires="wps">
                   <w:drawing>
-                    <ns2:anchor distT="0" distB="0" distL="114300" distR="114300" simplePos="0" relativeHeight="251673088" behindDoc="0" locked="0" layoutInCell="1" allowOverlap="1" ns3:anchorId="764DD254" ns3:editId="228ADBED">
-                      <ns2:simplePos x="0" y="0"/>
-                      <ns2:positionH relativeFrom="column">
-                        <ns2:posOffset>913130</ns2:posOffset>
-                      </ns2:positionH>
-                      <ns2:positionV relativeFrom="paragraph">
-                        <ns2:posOffset>254000</ns2:posOffset>
-                      </ns2:positionV>
-                      <ns2:extent cx="3143250" cy="0"/>
-                      <ns2:effectExtent l="0" t="0" r="0" b="0"/>
-                      <ns2:wrapNone/>
-                      <ns2:docPr id="2" name="Đường kết nối Thẳng 1"/>
-                      <ns2:cNvGraphicFramePr/>
-                      <ns4:graphic>
-                        <ns4:graphicData uri="http://schemas.microsoft.com/office/word/2010/wordprocessingShape">
-                          <ns5:wsp>
-                            <ns5:cNvCnPr/>
-                            <ns5:spPr>
-                              <ns4:xfrm>
-                                <ns4:off x="0" y="0"/>
-                                <ns4:ext cx="3143250" cy="0"/>
-                              </ns4:xfrm>
-                              <ns4:prstGeom prst="line">
-                                <ns4:avLst/>
-                              </ns4:prstGeom>
-                              <ns4:ln>
-                                <ns4:solidFill>
-                                  <ns4:schemeClr val="tx1"/>
-                                </ns4:solidFill>
-                              </ns4:ln>
-                            </ns5:spPr>
-                            <ns5:style>
-                              <ns4:lnRef idx="1">
-                                <ns4:schemeClr val="accent1"/>
-                              </ns4:lnRef>
-                              <ns4:fillRef idx="0">
-                                <ns4:schemeClr val="accent1"/>
-                              </ns4:fillRef>
-                              <ns4:effectRef idx="0">
-                                <ns4:schemeClr val="accent1"/>
-                              </ns4:effectRef>
-                              <ns4:fontRef idx="minor">
-                                <ns4:schemeClr val="tx1"/>
-                              </ns4:fontRef>
-                            </ns5:style>
-                            <ns5:bodyPr/>
-                          </ns5:wsp>
-                        </ns4:graphicData>
-                      </ns4:graphic>
-                      <ns3:sizeRelH relativeFrom="margin">
-                        <ns3:pctWidth>0</ns3:pctWidth>
-                      </ns3:sizeRelH>
-                      <ns3:sizeRelV relativeFrom="margin">
-                        <ns3:pctHeight>0</ns3:pctHeight>
-                      </ns3:sizeRelV>
-                    </ns2:anchor>
+                    <wp:anchor distT="0" distB="0" distL="114300" distR="114300" simplePos="0" relativeHeight="251673088" behindDoc="0" locked="0" layoutInCell="1" allowOverlap="1" wp14:anchorId="764DD254" wp14:editId="228ADBED">
+                      <wp:simplePos x="0" y="0"/>
+                      <wp:positionH relativeFrom="column">
+                        <wp:posOffset>913130</wp:posOffset>
+                      </wp:positionH>
+                      <wp:positionV relativeFrom="paragraph">
+                        <wp:posOffset>254000</wp:posOffset>
+                      </wp:positionV>
+                      <wp:extent cx="3143250" cy="0"/>
+                      <wp:effectExtent l="0" t="0" r="0" b="0"/>
+                      <wp:wrapNone/>
+                      <wp:docPr id="2" name="Đường kết nối Thẳng 1"/>
+                      <wp:cNvGraphicFramePr/>
+                      <a:graphic xmlns:a="http://schemas.openxmlformats.org/drawingml/2006/main">
+                        <a:graphicData uri="http://schemas.microsoft.com/office/word/2010/wordprocessingShape">
+                          <wps:wsp>
+                            <wps:cNvCnPr/>
+                            <wps:spPr>
+                              <a:xfrm>
+                                <a:off x="0" y="0"/>
+                                <a:ext cx="3143250" cy="0"/>
+                              </a:xfrm>
+                              <a:prstGeom prst="line">
+                                <a:avLst/>
+                              </a:prstGeom>
+                              <a:ln>
+                                <a:solidFill>
+                                  <a:schemeClr val="tx1"/>
+                                </a:solidFill>
+                              </a:ln>
+                            </wps:spPr>
+                            <wps:style>
+                              <a:lnRef idx="1">
+                                <a:schemeClr val="accent1"/>
+                              </a:lnRef>
+                              <a:fillRef idx="0">
+                                <a:schemeClr val="accent1"/>
+                              </a:fillRef>
+                              <a:effectRef idx="0">
+                                <a:schemeClr val="accent1"/>
+                              </a:effectRef>
+                              <a:fontRef idx="minor">
+                                <a:schemeClr val="tx1"/>
+                              </a:fontRef>
+                            </wps:style>
+                            <wps:bodyPr/>
+                          </wps:wsp>
+                        </a:graphicData>
+                      </a:graphic>
+                      <wp14:sizeRelH relativeFrom="margin">
+                        <wp14:pctWidth>0</wp14:pctWidth>
+                      </wp14:sizeRelH>
+                      <wp14:sizeRelV relativeFrom="margin">
+                        <wp14:pctHeight>0</wp14:pctHeight>
+                      </wp14:sizeRelV>
+                    </wp:anchor>
                   </w:drawing>
-                </ns1:Choice>
-                <ns1:Fallback>
+                </mc:Choice>
+                <mc:Fallback>
                   <w:pict>
-                    <ns6:line ns7:anchorId="0D776FBD" id="Đường kết nối Thẳng 1" ns8:spid="_x0000_s1026" style="position:absolute;z-index:251673088;visibility:visible;mso-wrap-style:square;mso-width-percent:0;mso-height-percent:0;mso-wrap-distance-left:9pt;mso-wrap-distance-top:0;mso-wrap-distance-right:9pt;mso-wrap-distance-bottom:0;mso-position-horizontal:absolute;mso-position-horizontal-relative:text;mso-position-vertical:absolute;mso-position-vertical-relative:text;mso-width-percent:0;mso-height-percent:0;mso-width-relative:margin;mso-height-relative:margin" from="71.9pt,20pt" to="319.4pt,20pt" ns8:gfxdata="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" strokecolor="black [3213]"/>
+                    <v:line w14:anchorId="0D776FBD" id="Đường kết nối Thẳng 1" o:spid="_x0000_s1026" style="position:absolute;z-index:251673088;visibility:visible;mso-wrap-style:square;mso-width-percent:0;mso-height-percent:0;mso-wrap-distance-left:9pt;mso-wrap-distance-top:0;mso-wrap-distance-right:9pt;mso-wrap-distance-bottom:0;mso-position-horizontal:absolute;mso-position-horizontal-relative:text;mso-position-vertical:absolute;mso-position-vertical-relative:text;mso-width-percent:0;mso-height-percent:0;mso-width-relative:margin;mso-height-relative:margin" from="71.9pt,20pt" to="319.4pt,20pt" o:gfxdata="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" strokecolor="black [3213]"/>
                   </w:pict>
-                </ns1:Fallback>
-              </ns1:AlternateContent>
+                </mc:Fallback>
+              </mc:AlternateContent>
             </w:r>
             <w:r>
               <w:rPr>
@@ -546,10 +648,7 @@
         </w:rPr>
       </w:pPr>
       <w:r>
-        <w:rPr>
-          <w:rFonts w:ascii="Times New Roman" w:hAnsi="Times New Roman"/>
-        </w:rPr>
-        <w:t xml:space="preserve">- Họ tên: {fullName} - Ngày sinh: {birthDate_formatted} - Giới tính: {gender_nam} Nam  {gender_nu} Nữ</w:t>
+        <w:t>- Họ tên: - Ngày sinh: {birthDate_formatted} //- Giới tính:   Nam   Nữ</w:t>
       </w:r>
     </w:p>
     <w:p>
@@ -563,10 +662,7 @@
         </w:rPr>
       </w:pPr>
       <w:r>
-        <w:rPr>
-          <w:rFonts w:ascii="Times New Roman" w:hAnsi="Times New Roman"/>
-        </w:rPr>
-        <w:t xml:space="preserve">- Nơi sinh: {birthPlace} - Quốc tịch: {nationality}</w:t>
+        <w:t xml:space="preserve">- Nơi sinh: {birthPlace} …………………  - Quốc tịch: ……………… </w:t>
       </w:r>
     </w:p>
     <w:p>
@@ -580,10 +676,7 @@
         </w:rPr>
       </w:pPr>
       <w:r>
-        <w:rPr>
-          <w:rFonts w:ascii="Times New Roman" w:hAnsi="Times New Roman"/>
-        </w:rPr>
-        <w:t xml:space="preserve">(Nơi sinh: Học viên ghi đúng tên tỉnh ghi trên giấy khai sinh)</w:t>
+        <w:t>(Nơi sinh: {birthPlace} Học viên ghi đúng tên tỉnh ghi trên giấy khai sinh)</w:t>
       </w:r>
     </w:p>
     <w:p>
@@ -597,10 +690,7 @@
         </w:rPr>
       </w:pPr>
       <w:r>
-        <w:rPr>
-          <w:rFonts w:ascii="Times New Roman" w:hAnsi="Times New Roman"/>
-        </w:rPr>
-        <w:t xml:space="preserve">- Dân tộc: {ethnic} - Tôn giáo: {religion}</w:t>
+        <w:t xml:space="preserve">- Dân tộc: {ethnic}  - Tôn giáo: </w:t>
       </w:r>
     </w:p>
     <w:p>
@@ -616,9 +706,179 @@
       </w:pPr>
       <w:r>
         <w:rPr>
-          <w:rFonts w:ascii="Times New Roman" w:hAnsi="Times New Roman"/>
-        </w:rPr>
-        <w:t xml:space="preserve">- Số CCCD: {cccd} - Ngày cấp: {cccdIssuedDate_formatted} - Nơi cấp CCCD: {cccdIssuedPlace}</w:t>
+          <w:rFonts w:ascii="Times New Roman" w:hAnsi="Times New Roman" w:cs="Times New Roman"/>
+          <w:color w:val="000000"/>
+          <w:sz w:val="26"/>
+          <w:szCs w:val="26"/>
+          <w:lang w:val="vi-VN"/>
+        </w:rPr>
+        <w:t>- Số C</w:t>
+      </w:r>
+      <w:r>
+        <w:rPr>
+          <w:rFonts w:ascii="Times New Roman" w:hAnsi="Times New Roman" w:cs="Times New Roman"/>
+          <w:color w:val="000000"/>
+          <w:sz w:val="26"/>
+          <w:szCs w:val="26"/>
+        </w:rPr>
+        <w:t>CCD</w:t>
+      </w:r>
+      <w:r>
+        <w:rPr>
+          <w:rFonts w:ascii="Times New Roman" w:hAnsi="Times New Roman" w:cs="Times New Roman"/>
+          <w:color w:val="000000"/>
+          <w:sz w:val="26"/>
+          <w:szCs w:val="26"/>
+          <w:lang w:val="vi-VN"/>
+        </w:rPr>
+        <w:t>: .........…</w:t>
+      </w:r>
+      <w:r>
+        <w:rPr>
+          <w:rFonts w:ascii="Times New Roman" w:hAnsi="Times New Roman" w:cs="Times New Roman"/>
+          <w:color w:val="000000"/>
+          <w:sz w:val="26"/>
+          <w:szCs w:val="26"/>
+        </w:rPr>
+        <w:t>…….</w:t>
+      </w:r>
+      <w:r>
+        <w:rPr>
+          <w:rFonts w:ascii="Times New Roman" w:hAnsi="Times New Roman" w:cs="Times New Roman"/>
+          <w:color w:val="000000"/>
+          <w:sz w:val="26"/>
+          <w:szCs w:val="26"/>
+          <w:lang w:val="vi-VN"/>
+        </w:rPr>
+        <w:t>............</w:t>
+      </w:r>
+      <w:r>
+        <w:rPr>
+          <w:rFonts w:ascii="Times New Roman" w:hAnsi="Times New Roman" w:cs="Times New Roman"/>
+          <w:color w:val="000000"/>
+          <w:sz w:val="26"/>
+          <w:szCs w:val="26"/>
+        </w:rPr>
+        <w:t>.</w:t>
+      </w:r>
+      <w:r>
+        <w:rPr>
+          <w:rFonts w:ascii="Times New Roman" w:hAnsi="Times New Roman" w:cs="Times New Roman"/>
+          <w:color w:val="000000"/>
+          <w:sz w:val="26"/>
+          <w:szCs w:val="26"/>
+          <w:lang w:val="vi-VN"/>
+        </w:rPr>
+        <w:t xml:space="preserve">.. </w:t>
+      </w:r>
+      <w:r>
+        <w:rPr>
+          <w:rFonts w:ascii="Times New Roman" w:hAnsi="Times New Roman" w:cs="Times New Roman"/>
+          <w:color w:val="000000"/>
+          <w:spacing w:val="-6"/>
+          <w:sz w:val="26"/>
+          <w:szCs w:val="26"/>
+          <w:lang w:val="vi-VN"/>
+        </w:rPr>
+        <w:t xml:space="preserve"> - Ngày cấp: .</w:t>
+      </w:r>
+      <w:r>
+        <w:rPr>
+          <w:rFonts w:ascii="Times New Roman" w:hAnsi="Times New Roman" w:cs="Times New Roman"/>
+          <w:color w:val="000000"/>
+          <w:sz w:val="26"/>
+          <w:szCs w:val="26"/>
+          <w:lang w:val="vi-VN"/>
+        </w:rPr>
+        <w:t>..... /....../........ -</w:t>
+      </w:r>
+      <w:r>
+        <w:rPr>
+          <w:rFonts w:ascii="Times New Roman" w:hAnsi="Times New Roman" w:cs="Times New Roman"/>
+          <w:color w:val="000000"/>
+          <w:spacing w:val="-6"/>
+          <w:sz w:val="26"/>
+          <w:szCs w:val="26"/>
+          <w:lang w:val="vi-VN"/>
+        </w:rPr>
+        <w:t xml:space="preserve"> Nơi cấp</w:t>
+      </w:r>
+      <w:r>
+        <w:rPr>
+          <w:rFonts w:ascii="Times New Roman" w:hAnsi="Times New Roman" w:cs="Times New Roman"/>
+          <w:color w:val="000000"/>
+          <w:spacing w:val="-6"/>
+          <w:sz w:val="26"/>
+          <w:szCs w:val="26"/>
+        </w:rPr>
+        <w:t xml:space="preserve"> </w:t>
+      </w:r>
+      <w:r>
+        <w:rPr>
+          <w:rFonts w:ascii="Times New Roman" w:hAnsi="Times New Roman" w:cs="Times New Roman"/>
+          <w:color w:val="000000"/>
+          <w:spacing w:val="-6"/>
+          <w:sz w:val="26"/>
+          <w:szCs w:val="26"/>
+        </w:rPr>
+        <w:t>CCCD</w:t>
+      </w:r>
+      <w:r>
+        <w:rPr>
+          <w:rFonts w:ascii="Times New Roman" w:hAnsi="Times New Roman" w:cs="Times New Roman"/>
+          <w:color w:val="000000"/>
+          <w:sz w:val="26"/>
+          <w:szCs w:val="26"/>
+          <w:lang w:val="vi-VN"/>
+        </w:rPr>
+        <w:t>:....................</w:t>
+      </w:r>
+      <w:r>
+        <w:rPr>
+          <w:rFonts w:ascii="Times New Roman" w:hAnsi="Times New Roman" w:cs="Times New Roman"/>
+          <w:color w:val="000000"/>
+          <w:sz w:val="26"/>
+          <w:szCs w:val="26"/>
+          <w:lang w:val="vi-VN"/>
+        </w:rPr>
+        <w:t>...............</w:t>
+      </w:r>
+      <w:r>
+        <w:rPr>
+          <w:rFonts w:ascii="Times New Roman" w:hAnsi="Times New Roman" w:cs="Times New Roman"/>
+          <w:color w:val="000000"/>
+          <w:sz w:val="26"/>
+          <w:szCs w:val="26"/>
+        </w:rPr>
+        <w:t xml:space="preserve"> </w:t>
+      </w:r>
+      <w:r>
+        <w:rPr>
+          <w:rFonts w:ascii="Times New Roman" w:hAnsi="Times New Roman" w:cs="Times New Roman"/>
+          <w:color w:val="000000"/>
+          <w:sz w:val="26"/>
+          <w:szCs w:val="26"/>
+          <w:lang w:val="vi-VN"/>
+        </w:rPr>
+        <w:t>.....................</w:t>
+      </w:r>
+      <w:r>
+        <w:rPr>
+          <w:rFonts w:ascii="Times New Roman" w:hAnsi="Times New Roman" w:cs="Times New Roman"/>
+          <w:color w:val="000000"/>
+          <w:sz w:val="26"/>
+          <w:szCs w:val="26"/>
+        </w:rPr>
+        <w:t>………………………………………</w:t>
+      </w:r>
+      <w:r>
+        <w:rPr>
+          <w:rFonts w:ascii="Times New Roman" w:hAnsi="Times New Roman" w:cs="Times New Roman"/>
+          <w:color w:val="000000"/>
+          <w:sz w:val="26"/>
+          <w:szCs w:val="26"/>
+        </w:rPr>
+        <w:t>………………………………………………………</w:t>
       </w:r>
     </w:p>
     <w:p>
@@ -633,9 +893,103 @@
       </w:pPr>
       <w:r>
         <w:rPr>
-          <w:rFonts w:ascii="Times New Roman" w:hAnsi="Times New Roman"/>
-        </w:rPr>
-        <w:t xml:space="preserve">- Số CMND: {cmnd} - Ngày cấp: {cmndIssuedDate_formatted} - Nơi cấp CNMD: {cmndIssuedPlace}</w:t>
+          <w:rFonts w:ascii="Times New Roman" w:hAnsi="Times New Roman" w:cs="Times New Roman"/>
+          <w:color w:val="000000"/>
+          <w:sz w:val="26"/>
+          <w:szCs w:val="26"/>
+          <w:lang w:val="vi-VN"/>
+        </w:rPr>
+        <w:t>- Số CMND: .................…</w:t>
+      </w:r>
+      <w:r>
+        <w:rPr>
+          <w:rFonts w:ascii="Times New Roman" w:hAnsi="Times New Roman" w:cs="Times New Roman"/>
+          <w:color w:val="000000"/>
+          <w:sz w:val="26"/>
+          <w:szCs w:val="26"/>
+        </w:rPr>
+        <w:t>…….</w:t>
+      </w:r>
+      <w:r>
+        <w:rPr>
+          <w:rFonts w:ascii="Times New Roman" w:hAnsi="Times New Roman" w:cs="Times New Roman"/>
+          <w:color w:val="000000"/>
+          <w:sz w:val="26"/>
+          <w:szCs w:val="26"/>
+          <w:lang w:val="vi-VN"/>
+        </w:rPr>
+        <w:t xml:space="preserve">...... </w:t>
+      </w:r>
+      <w:r>
+        <w:rPr>
+          <w:rFonts w:ascii="Times New Roman" w:hAnsi="Times New Roman" w:cs="Times New Roman"/>
+          <w:color w:val="000000"/>
+          <w:spacing w:val="-6"/>
+          <w:sz w:val="26"/>
+          <w:szCs w:val="26"/>
+          <w:lang w:val="vi-VN"/>
+        </w:rPr>
+        <w:t xml:space="preserve"> - Ngày cấp: .</w:t>
+      </w:r>
+      <w:r>
+        <w:rPr>
+          <w:rFonts w:ascii="Times New Roman" w:hAnsi="Times New Roman" w:cs="Times New Roman"/>
+          <w:color w:val="000000"/>
+          <w:sz w:val="26"/>
+          <w:szCs w:val="26"/>
+          <w:lang w:val="vi-VN"/>
+        </w:rPr>
+        <w:t>..... /....../........ -</w:t>
+      </w:r>
+      <w:r>
+        <w:rPr>
+          <w:rFonts w:ascii="Times New Roman" w:hAnsi="Times New Roman" w:cs="Times New Roman"/>
+          <w:color w:val="000000"/>
+          <w:spacing w:val="-6"/>
+          <w:sz w:val="26"/>
+          <w:szCs w:val="26"/>
+          <w:lang w:val="vi-VN"/>
+        </w:rPr>
+        <w:t xml:space="preserve"> Nơi cấp</w:t>
+      </w:r>
+      <w:r>
+        <w:rPr>
+          <w:rFonts w:ascii="Times New Roman" w:hAnsi="Times New Roman" w:cs="Times New Roman"/>
+          <w:color w:val="000000"/>
+          <w:spacing w:val="-6"/>
+          <w:sz w:val="26"/>
+          <w:szCs w:val="26"/>
+        </w:rPr>
+        <w:t xml:space="preserve"> CNMD</w:t>
+      </w:r>
+      <w:r>
+        <w:rPr>
+          <w:rFonts w:ascii="Times New Roman" w:hAnsi="Times New Roman" w:cs="Times New Roman"/>
+          <w:color w:val="000000"/>
+          <w:sz w:val="26"/>
+          <w:szCs w:val="26"/>
+          <w:lang w:val="vi-VN"/>
+        </w:rPr>
+        <w:t xml:space="preserve">: </w:t>
+      </w:r>
+      <w:r>
+        <w:rPr>
+          <w:rFonts w:ascii="Times New Roman" w:hAnsi="Times New Roman" w:cs="Times New Roman"/>
+          <w:color w:val="000000"/>
+          <w:sz w:val="26"/>
+          <w:szCs w:val="26"/>
+          <w:lang w:val="vi-VN"/>
+        </w:rPr>
+        <w:t>................................</w:t>
+      </w:r>
+      <w:r>
+        <w:rPr>
+          <w:rFonts w:ascii="Times New Roman" w:hAnsi="Times New Roman" w:cs="Times New Roman"/>
+          <w:color w:val="000000"/>
+          <w:sz w:val="26"/>
+          <w:szCs w:val="26"/>
+        </w:rPr>
+        <w:t>..</w:t>
       </w:r>
     </w:p>
     <w:p>
@@ -650,9 +1004,138 @@
       </w:pPr>
       <w:r>
         <w:rPr>
-          <w:rFonts w:ascii="Times New Roman" w:hAnsi="Times New Roman"/>
-        </w:rPr>
-        <w:t xml:space="preserve">- Khuyết tật: {disability_co} Có  {disability_khong} Không - Loại Khuyết tật: {disabilityType}</w:t>
+          <w:rFonts w:ascii="Times New Roman" w:hAnsi="Times New Roman" w:cs="Times New Roman"/>
+          <w:color w:val="000000"/>
+          <w:sz w:val="26"/>
+          <w:szCs w:val="26"/>
+        </w:rPr>
+        <w:t>- Khuyết tật</w:t>
+      </w:r>
+      <w:r>
+        <w:rPr>
+          <w:rFonts w:ascii="Times New Roman" w:hAnsi="Times New Roman" w:cs="Times New Roman"/>
+          <w:color w:val="000000"/>
+          <w:sz w:val="26"/>
+          <w:szCs w:val="26"/>
+        </w:rPr>
+        <w:t xml:space="preserve">: </w:t>
+      </w:r>
+      <w:r>
+        <w:rPr>
+          <w:rFonts w:ascii="Times New Roman" w:hAnsi="Times New Roman" w:cs="Times New Roman"/>
+          <w:color w:val="000000"/>
+          <w:sz w:val="26"/>
+          <w:szCs w:val="26"/>
+        </w:rPr>
+        <w:t xml:space="preserve"> </w:t>
+      </w:r>
+      <w:r>
+        <w:rPr>
+          <w:rFonts w:ascii="Times New Roman" w:hAnsi="Times New Roman" w:cs="Times New Roman"/>
+          <w:color w:val="000000"/>
+          <w:sz w:val="26"/>
+          <w:szCs w:val="26"/>
+        </w:rPr>
+        <w:t xml:space="preserve">     </w:t>
+      </w:r>
+      <w:r>
+        <w:rPr>
+          <w:rFonts w:ascii="Times New Roman" w:hAnsi="Times New Roman"/>
+          <w:color w:val="000000"/>
+          <w:sz w:val="26"/>
+          <w:szCs w:val="26"/>
+        </w:rPr>
+        <w:sym w:font="Wingdings 2" w:char="00A3"/>
+      </w:r>
+      <w:r>
+        <w:rPr>
+          <w:rFonts w:ascii="Times New Roman" w:hAnsi="Times New Roman"/>
+          <w:color w:val="000000"/>
+          <w:sz w:val="26"/>
+          <w:szCs w:val="26"/>
+        </w:rPr>
+        <w:t xml:space="preserve"> Có </w:t>
+      </w:r>
+      <w:r>
+        <w:rPr>
+          <w:rFonts w:ascii="Times New Roman" w:hAnsi="Times New Roman"/>
+          <w:color w:val="000000"/>
+          <w:sz w:val="26"/>
+          <w:szCs w:val="26"/>
+        </w:rPr>
+        <w:t xml:space="preserve">           </w:t>
+      </w:r>
+      <w:r>
+        <w:rPr>
+          <w:rFonts w:ascii="Times New Roman" w:hAnsi="Times New Roman"/>
+          <w:color w:val="000000"/>
+          <w:sz w:val="26"/>
+          <w:szCs w:val="26"/>
+        </w:rPr>
+        <w:t xml:space="preserve"> </w:t>
+      </w:r>
+      <w:r>
+        <w:rPr>
+          <w:rFonts w:ascii="Times New Roman" w:hAnsi="Times New Roman"/>
+          <w:color w:val="000000"/>
+          <w:sz w:val="26"/>
+          <w:szCs w:val="26"/>
+        </w:rPr>
+        <w:sym w:font="Wingdings 2" w:char="00A3"/>
+      </w:r>
+      <w:r>
+        <w:rPr>
+          <w:rFonts w:ascii="Times New Roman" w:hAnsi="Times New Roman"/>
+          <w:color w:val="000000"/>
+          <w:sz w:val="26"/>
+          <w:szCs w:val="26"/>
+        </w:rPr>
+        <w:t xml:space="preserve"> Không</w:t>
+      </w:r>
+      <w:r>
+        <w:rPr>
+          <w:rFonts w:ascii="Times New Roman" w:hAnsi="Times New Roman"/>
+          <w:color w:val="000000"/>
+          <w:sz w:val="26"/>
+          <w:szCs w:val="26"/>
+        </w:rPr>
+        <w:t xml:space="preserve">          </w:t>
+      </w:r>
+      <w:r>
+        <w:rPr>
+          <w:rFonts w:ascii="Times New Roman" w:hAnsi="Times New Roman" w:cs="Times New Roman"/>
+          <w:color w:val="000000"/>
+          <w:sz w:val="26"/>
+          <w:szCs w:val="26"/>
+        </w:rPr>
+        <w:t>- Loại Khuyết tật</w:t>
+      </w:r>
+      <w:r>
+        <w:rPr>
+          <w:rFonts w:ascii="Times New Roman" w:hAnsi="Times New Roman" w:cs="Times New Roman"/>
+          <w:color w:val="000000"/>
+          <w:sz w:val="26"/>
+          <w:szCs w:val="26"/>
+        </w:rPr>
+        <w:t>:  ……………………………………..</w:t>
+      </w:r>
+      <w:r>
+        <w:rPr>
+          <w:rFonts w:ascii="Times New Roman" w:hAnsi="Times New Roman" w:cs="Times New Roman"/>
+          <w:color w:val="000000"/>
+          <w:sz w:val="26"/>
+          <w:szCs w:val="26"/>
+        </w:rPr>
+        <w:t>.</w:t>
+      </w:r>
+      <w:r>
+        <w:rPr>
+          <w:rFonts w:ascii="Times New Roman" w:hAnsi="Times New Roman" w:cs="Times New Roman"/>
+          <w:color w:val="000000"/>
+          <w:sz w:val="26"/>
+          <w:szCs w:val="26"/>
+        </w:rPr>
+        <w:t xml:space="preserve">  </w:t>
       </w:r>
     </w:p>
     <w:p>
@@ -666,10 +1149,7 @@
         </w:rPr>
       </w:pPr>
       <w:r>
-        <w:rPr>
-          <w:rFonts w:ascii="Times New Roman" w:hAnsi="Times New Roman"/>
-        </w:rPr>
-        <w:t xml:space="preserve">- Quê quán: {hometown} - Số sổ bảo hiểm xã hội: {socialInsuranceId}</w:t>
+        <w:t>- Quê quán: {hometown} ………………………………………………….. - Số sổ bảo hiểm xã hội:………………</w:t>
       </w:r>
     </w:p>
     <w:p>
@@ -684,9 +1164,113 @@
       </w:pPr>
       <w:r>
         <w:rPr>
-          <w:rFonts w:ascii="Times New Roman" w:hAnsi="Times New Roman"/>
-        </w:rPr>
-        <w:t xml:space="preserve">- Ngày vào Đoàn: {unionJoinDate_formatted} - Ngày vào Đảng: {partyJoinDate_formatted} - Ngày vào Đảng chính thức: {officialPartyJoinDate_formatted}</w:t>
+          <w:rFonts w:ascii="Times New Roman" w:hAnsi="Times New Roman" w:cs="Times New Roman"/>
+          <w:color w:val="000000"/>
+          <w:sz w:val="26"/>
+          <w:szCs w:val="26"/>
+        </w:rPr>
+        <w:t>- Ngày vào Đoàn:</w:t>
+      </w:r>
+      <w:r>
+        <w:rPr>
+          <w:rFonts w:ascii="Times New Roman" w:hAnsi="Times New Roman" w:cs="Times New Roman"/>
+          <w:color w:val="000000"/>
+          <w:sz w:val="26"/>
+          <w:szCs w:val="26"/>
+        </w:rPr>
+        <w:t xml:space="preserve"> </w:t>
+      </w:r>
+      <w:r>
+        <w:rPr>
+          <w:rFonts w:ascii="Times New Roman" w:hAnsi="Times New Roman" w:cs="Times New Roman"/>
+          <w:color w:val="000000"/>
+          <w:sz w:val="26"/>
+          <w:szCs w:val="26"/>
+        </w:rPr>
+        <w:t>……………</w:t>
+      </w:r>
+      <w:r>
+        <w:rPr>
+          <w:rFonts w:ascii="Times New Roman" w:hAnsi="Times New Roman" w:cs="Times New Roman"/>
+          <w:color w:val="000000"/>
+          <w:sz w:val="26"/>
+          <w:szCs w:val="26"/>
+        </w:rPr>
+        <w:t xml:space="preserve">  - </w:t>
+      </w:r>
+      <w:r>
+        <w:rPr>
+          <w:rFonts w:ascii="Times New Roman" w:hAnsi="Times New Roman" w:cs="Times New Roman"/>
+          <w:color w:val="000000"/>
+          <w:sz w:val="26"/>
+          <w:szCs w:val="26"/>
+        </w:rPr>
+        <w:t>Ngày vào Đảng:</w:t>
+      </w:r>
+      <w:r>
+        <w:rPr>
+          <w:rFonts w:ascii="Times New Roman" w:hAnsi="Times New Roman" w:cs="Times New Roman"/>
+          <w:color w:val="000000"/>
+          <w:sz w:val="26"/>
+          <w:szCs w:val="26"/>
+        </w:rPr>
+        <w:t xml:space="preserve"> </w:t>
+      </w:r>
+      <w:r>
+        <w:rPr>
+          <w:rFonts w:ascii="Times New Roman" w:hAnsi="Times New Roman" w:cs="Times New Roman"/>
+          <w:color w:val="000000"/>
+          <w:sz w:val="26"/>
+          <w:szCs w:val="26"/>
+        </w:rPr>
+        <w:t>…………</w:t>
+      </w:r>
+      <w:r>
+        <w:rPr>
+          <w:rFonts w:ascii="Times New Roman" w:hAnsi="Times New Roman" w:cs="Times New Roman"/>
+          <w:color w:val="000000"/>
+          <w:sz w:val="26"/>
+          <w:szCs w:val="26"/>
+        </w:rPr>
+        <w:t xml:space="preserve">  - </w:t>
+      </w:r>
+      <w:r>
+        <w:rPr>
+          <w:rFonts w:ascii="Times New Roman" w:hAnsi="Times New Roman" w:cs="Times New Roman"/>
+          <w:color w:val="000000"/>
+          <w:sz w:val="26"/>
+          <w:szCs w:val="26"/>
+        </w:rPr>
+        <w:t xml:space="preserve">Ngày vào Đảng chính </w:t>
+      </w:r>
+      <w:proofErr w:type="gramStart"/>
+      <w:r>
+        <w:rPr>
+          <w:rFonts w:ascii="Times New Roman" w:hAnsi="Times New Roman" w:cs="Times New Roman"/>
+          <w:color w:val="000000"/>
+          <w:sz w:val="26"/>
+          <w:szCs w:val="26"/>
+        </w:rPr>
+        <w:t>thức:</w:t>
+      </w:r>
+      <w:r>
+        <w:rPr>
+          <w:rFonts w:ascii="Times New Roman" w:hAnsi="Times New Roman" w:cs="Times New Roman"/>
+          <w:color w:val="000000"/>
+          <w:sz w:val="26"/>
+          <w:szCs w:val="26"/>
+        </w:rPr>
+        <w:t>…</w:t>
+      </w:r>
+      <w:proofErr w:type="gramEnd"/>
+      <w:r>
+        <w:rPr>
+          <w:rFonts w:ascii="Times New Roman" w:hAnsi="Times New Roman" w:cs="Times New Roman"/>
+          <w:color w:val="000000"/>
+          <w:sz w:val="26"/>
+          <w:szCs w:val="26"/>
+        </w:rPr>
+        <w:t>…………</w:t>
       </w:r>
     </w:p>
     <w:p>
@@ -701,9 +1285,62 @@
       </w:pPr>
       <w:r>
         <w:rPr>
-          <w:rFonts w:ascii="Times New Roman" w:hAnsi="Times New Roman"/>
-        </w:rPr>
-        <w:t xml:space="preserve">- Cơ quan công tác: {workPlace}</w:t>
+          <w:rFonts w:ascii="Times New Roman" w:hAnsi="Times New Roman" w:cs="Times New Roman"/>
+          <w:color w:val="000000"/>
+          <w:spacing w:val="-6"/>
+          <w:sz w:val="26"/>
+          <w:szCs w:val="26"/>
+          <w:lang w:val="vi-VN"/>
+        </w:rPr>
+        <w:t>- Cơ quan công tác</w:t>
+      </w:r>
+      <w:r>
+        <w:rPr>
+          <w:rFonts w:ascii="Times New Roman" w:hAnsi="Times New Roman" w:cs="Times New Roman"/>
+          <w:color w:val="000000"/>
+          <w:spacing w:val="-6"/>
+          <w:sz w:val="26"/>
+          <w:szCs w:val="26"/>
+        </w:rPr>
+        <w:t xml:space="preserve"> ….</w:t>
+      </w:r>
+      <w:r>
+        <w:rPr>
+          <w:rFonts w:ascii="Times New Roman" w:hAnsi="Times New Roman" w:cs="Times New Roman"/>
+          <w:color w:val="000000"/>
+          <w:sz w:val="26"/>
+          <w:szCs w:val="26"/>
+          <w:lang w:val="vi-VN"/>
+        </w:rPr>
+        <w:t>........................................…</w:t>
+      </w:r>
+      <w:r>
+        <w:rPr>
+          <w:rFonts w:ascii="Times New Roman" w:hAnsi="Times New Roman" w:cs="Times New Roman"/>
+          <w:color w:val="000000"/>
+          <w:sz w:val="26"/>
+          <w:szCs w:val="26"/>
+        </w:rPr>
+        <w:t>………………………………………………….</w:t>
+      </w:r>
+      <w:r>
+        <w:rPr>
+          <w:rFonts w:ascii="Times New Roman" w:hAnsi="Times New Roman" w:cs="Times New Roman"/>
+          <w:color w:val="000000"/>
+          <w:sz w:val="26"/>
+          <w:szCs w:val="26"/>
+          <w:lang w:val="vi-VN"/>
+        </w:rPr>
+        <w:t>.....</w:t>
+      </w:r>
+      <w:r>
+        <w:rPr>
+          <w:rFonts w:ascii="Times New Roman" w:hAnsi="Times New Roman" w:cs="Times New Roman"/>
+          <w:color w:val="000000"/>
+          <w:sz w:val="26"/>
+          <w:szCs w:val="26"/>
+        </w:rPr>
+        <w:t>.....</w:t>
       </w:r>
     </w:p>
     <w:p>
@@ -718,9 +1355,60 @@
       </w:pPr>
       <w:r>
         <w:rPr>
-          <w:rFonts w:ascii="Times New Roman" w:hAnsi="Times New Roman"/>
-        </w:rPr>
-        <w:t xml:space="preserve">- Số điện thoại học viên: {phone}</w:t>
+          <w:rFonts w:ascii="Times New Roman" w:hAnsi="Times New Roman" w:cs="Times New Roman"/>
+          <w:color w:val="000000"/>
+          <w:sz w:val="26"/>
+          <w:szCs w:val="26"/>
+          <w:lang w:val="vi-VN"/>
+        </w:rPr>
+        <w:t>- Số điện thoại</w:t>
+      </w:r>
+      <w:r>
+        <w:rPr>
+          <w:rFonts w:ascii="Times New Roman" w:hAnsi="Times New Roman" w:cs="Times New Roman"/>
+          <w:color w:val="000000"/>
+          <w:sz w:val="26"/>
+          <w:szCs w:val="26"/>
+        </w:rPr>
+        <w:t xml:space="preserve"> học viên</w:t>
+      </w:r>
+      <w:r>
+        <w:rPr>
+          <w:rFonts w:ascii="Times New Roman" w:hAnsi="Times New Roman" w:cs="Times New Roman"/>
+          <w:color w:val="000000"/>
+          <w:sz w:val="26"/>
+          <w:szCs w:val="26"/>
+          <w:lang w:val="vi-VN"/>
+        </w:rPr>
+        <w:t>: ....................................</w:t>
+      </w:r>
+      <w:r>
+        <w:rPr>
+          <w:rFonts w:ascii="Times New Roman" w:hAnsi="Times New Roman" w:cs="Times New Roman"/>
+          <w:color w:val="000000"/>
+          <w:sz w:val="26"/>
+          <w:szCs w:val="26"/>
+        </w:rPr>
+        <w:t>......................</w:t>
+      </w:r>
+      <w:r>
+        <w:rPr>
+          <w:rFonts w:ascii="Times New Roman" w:hAnsi="Times New Roman" w:cs="Times New Roman"/>
+          <w:color w:val="000000"/>
+          <w:sz w:val="26"/>
+          <w:szCs w:val="26"/>
+          <w:lang w:val="vi-VN"/>
+        </w:rPr>
+        <w:t>..</w:t>
+      </w:r>
+      <w:r>
+        <w:rPr>
+          <w:rFonts w:ascii="Times New Roman" w:hAnsi="Times New Roman"/>
+          <w:color w:val="000000"/>
+          <w:sz w:val="26"/>
+          <w:szCs w:val="26"/>
+        </w:rPr>
+        <w:t>.................................................................</w:t>
       </w:r>
     </w:p>
     <w:p>
@@ -734,10 +1422,7 @@
         </w:rPr>
       </w:pPr>
       <w:r>
-        <w:rPr>
-          <w:rFonts w:ascii="Times New Roman" w:hAnsi="Times New Roman"/>
-        </w:rPr>
-        <w:t xml:space="preserve">- Email: {email}</w:t>
+        <w:t>- Email: {email}……………………………………………………</w:t>
       </w:r>
     </w:p>
     <w:p>
@@ -751,10 +1436,7 @@
         </w:rPr>
       </w:pPr>
       <w:r>
-        <w:rPr>
-          <w:rFonts w:ascii="Times New Roman" w:hAnsi="Times New Roman"/>
-        </w:rPr>
-        <w:t xml:space="preserve">- Họ tên người thân khi cần liên hệ: {emergencyContactName}</w:t>
+        <w:t>- Họ tên người thân khi cần liên hệ: {emergencyContactName} ……………………………………………………………………</w:t>
       </w:r>
     </w:p>
     <w:p>
@@ -768,10 +1450,7 @@
         </w:rPr>
       </w:pPr>
       <w:r>
-        <w:rPr>
-          <w:rFonts w:ascii="Times New Roman" w:hAnsi="Times New Roman"/>
-        </w:rPr>
-        <w:t xml:space="preserve">- Số điện thoại của người thân: {emergencyContactPhone}</w:t>
+        <w:t>- Số điện thoại của người thân: {emergencyContactPhone} …………………………………………………………………………</w:t>
       </w:r>
     </w:p>
     <w:p>
@@ -841,8 +1520,297 @@
       <w:r>
         <w:rPr>
           <w:rFonts w:ascii="Times New Roman" w:hAnsi="Times New Roman"/>
-        </w:rPr>
-        <w:t xml:space="preserve">- Hộ Khẩu Thường Trú: Số nhà: {perm_house} Tên đường: {perm_street} Tổ/Thôn/Xóm: {perm_hamlet} Xã/Phường: {perm_ward} Tỉnh/Thành phố: {perm_city}</w:t>
+          <w:b/>
+          <w:color w:val="000000"/>
+          <w:spacing w:val="-4"/>
+          <w:sz w:val="26"/>
+          <w:szCs w:val="26"/>
+          <w:lang w:val="vi-VN"/>
+        </w:rPr>
+        <w:t xml:space="preserve">- </w:t>
+      </w:r>
+      <w:r>
+        <w:rPr>
+          <w:rFonts w:ascii="Times New Roman" w:hAnsi="Times New Roman"/>
+          <w:b/>
+          <w:color w:val="000000"/>
+          <w:spacing w:val="-4"/>
+          <w:sz w:val="26"/>
+          <w:szCs w:val="26"/>
+        </w:rPr>
+        <w:t xml:space="preserve">Hộ Khẩu Thường Trú: </w:t>
+      </w:r>
+      <w:r>
+        <w:rPr>
+          <w:rFonts w:ascii="Times New Roman" w:hAnsi="Times New Roman"/>
+          <w:color w:val="000000"/>
+          <w:spacing w:val="-4"/>
+          <w:sz w:val="26"/>
+          <w:szCs w:val="26"/>
+          <w:lang w:val="vi-VN"/>
+        </w:rPr>
+        <w:t xml:space="preserve">Số </w:t>
+      </w:r>
+      <w:r>
+        <w:rPr>
+          <w:rFonts w:ascii="Times New Roman" w:hAnsi="Times New Roman"/>
+          <w:color w:val="000000"/>
+          <w:spacing w:val="-4"/>
+          <w:sz w:val="26"/>
+          <w:szCs w:val="26"/>
+        </w:rPr>
+        <w:t>nhà:</w:t>
+      </w:r>
+      <w:r>
+        <w:rPr>
+          <w:rFonts w:ascii="Times New Roman" w:hAnsi="Times New Roman"/>
+          <w:color w:val="000000"/>
+          <w:spacing w:val="-4"/>
+          <w:sz w:val="26"/>
+          <w:szCs w:val="26"/>
+          <w:lang w:val="vi-VN"/>
+        </w:rPr>
+        <w:t>….……</w:t>
+      </w:r>
+      <w:r>
+        <w:rPr>
+          <w:rFonts w:ascii="Times New Roman" w:hAnsi="Times New Roman"/>
+          <w:color w:val="000000"/>
+          <w:spacing w:val="-4"/>
+          <w:sz w:val="26"/>
+          <w:szCs w:val="26"/>
+        </w:rPr>
+        <w:t>……Tên</w:t>
+      </w:r>
+      <w:r>
+        <w:rPr>
+          <w:rFonts w:ascii="Times New Roman" w:hAnsi="Times New Roman"/>
+          <w:color w:val="000000"/>
+          <w:spacing w:val="-4"/>
+          <w:sz w:val="26"/>
+          <w:szCs w:val="26"/>
+        </w:rPr>
+        <w:t xml:space="preserve"> </w:t>
+      </w:r>
+      <w:proofErr w:type="gramStart"/>
+      <w:r>
+        <w:rPr>
+          <w:rFonts w:ascii="Times New Roman" w:hAnsi="Times New Roman"/>
+          <w:color w:val="000000"/>
+          <w:spacing w:val="-4"/>
+          <w:sz w:val="26"/>
+          <w:szCs w:val="26"/>
+        </w:rPr>
+        <w:t>đ</w:t>
+      </w:r>
+      <w:r>
+        <w:rPr>
+          <w:rFonts w:ascii="Times New Roman" w:hAnsi="Times New Roman"/>
+          <w:color w:val="000000"/>
+          <w:spacing w:val="-4"/>
+          <w:sz w:val="26"/>
+          <w:szCs w:val="26"/>
+          <w:lang w:val="vi-VN"/>
+        </w:rPr>
+        <w:t>ường</w:t>
+      </w:r>
+      <w:r>
+        <w:rPr>
+          <w:rFonts w:ascii="Times New Roman" w:hAnsi="Times New Roman"/>
+          <w:color w:val="000000"/>
+          <w:spacing w:val="-4"/>
+          <w:sz w:val="26"/>
+          <w:szCs w:val="26"/>
+        </w:rPr>
+        <w:t>:</w:t>
+      </w:r>
+      <w:r>
+        <w:rPr>
+          <w:rFonts w:ascii="Times New Roman" w:hAnsi="Times New Roman"/>
+          <w:color w:val="000000"/>
+          <w:spacing w:val="-4"/>
+          <w:sz w:val="26"/>
+          <w:szCs w:val="26"/>
+          <w:lang w:val="vi-VN"/>
+        </w:rPr>
+        <w:t>…</w:t>
+      </w:r>
+      <w:proofErr w:type="gramEnd"/>
+      <w:r>
+        <w:rPr>
+          <w:rFonts w:ascii="Times New Roman" w:hAnsi="Times New Roman"/>
+          <w:color w:val="000000"/>
+          <w:spacing w:val="-4"/>
+          <w:sz w:val="26"/>
+          <w:szCs w:val="26"/>
+          <w:lang w:val="vi-VN"/>
+        </w:rPr>
+        <w:t>.………</w:t>
+      </w:r>
+      <w:r>
+        <w:rPr>
+          <w:rFonts w:ascii="Times New Roman" w:hAnsi="Times New Roman"/>
+          <w:color w:val="000000"/>
+          <w:spacing w:val="-4"/>
+          <w:sz w:val="26"/>
+          <w:szCs w:val="26"/>
+        </w:rPr>
+        <w:t>……</w:t>
+      </w:r>
+      <w:r>
+        <w:rPr>
+          <w:rFonts w:ascii="Times New Roman" w:hAnsi="Times New Roman"/>
+          <w:color w:val="000000"/>
+          <w:spacing w:val="-4"/>
+          <w:sz w:val="26"/>
+          <w:szCs w:val="26"/>
+        </w:rPr>
+        <w:t xml:space="preserve">……………………………….. </w:t>
+      </w:r>
+      <w:r>
+        <w:rPr>
+          <w:rFonts w:ascii="Times New Roman" w:hAnsi="Times New Roman"/>
+          <w:color w:val="000000"/>
+          <w:spacing w:val="-4"/>
+          <w:sz w:val="26"/>
+          <w:szCs w:val="26"/>
+        </w:rPr>
+        <w:t>Tổ/Thôn/</w:t>
+      </w:r>
+      <w:proofErr w:type="gramStart"/>
+      <w:r>
+        <w:rPr>
+          <w:rFonts w:ascii="Times New Roman" w:hAnsi="Times New Roman"/>
+          <w:color w:val="000000"/>
+          <w:spacing w:val="-4"/>
+          <w:sz w:val="26"/>
+          <w:szCs w:val="26"/>
+        </w:rPr>
+        <w:t>Xóm:…</w:t>
+      </w:r>
+      <w:proofErr w:type="gramEnd"/>
+      <w:r>
+        <w:rPr>
+          <w:rFonts w:ascii="Times New Roman" w:hAnsi="Times New Roman"/>
+          <w:color w:val="000000"/>
+          <w:spacing w:val="-4"/>
+          <w:sz w:val="26"/>
+          <w:szCs w:val="26"/>
+        </w:rPr>
+        <w:t>………………</w:t>
+      </w:r>
+      <w:r>
+        <w:rPr>
+          <w:rFonts w:ascii="Times New Roman" w:hAnsi="Times New Roman"/>
+          <w:color w:val="000000"/>
+          <w:spacing w:val="-4"/>
+          <w:sz w:val="26"/>
+          <w:szCs w:val="26"/>
+        </w:rPr>
+        <w:t>……………...</w:t>
+      </w:r>
+      <w:r>
+        <w:rPr>
+          <w:rFonts w:ascii="Times New Roman" w:hAnsi="Times New Roman"/>
+          <w:color w:val="000000"/>
+          <w:spacing w:val="-4"/>
+          <w:sz w:val="26"/>
+          <w:szCs w:val="26"/>
+          <w:lang w:val="vi-VN"/>
+        </w:rPr>
+        <w:t>Xã/Phường: ..…</w:t>
+      </w:r>
+      <w:r>
+        <w:rPr>
+          <w:rFonts w:ascii="Times New Roman" w:hAnsi="Times New Roman"/>
+          <w:color w:val="000000"/>
+          <w:spacing w:val="-4"/>
+          <w:sz w:val="26"/>
+          <w:szCs w:val="26"/>
+        </w:rPr>
+        <w:t>………..</w:t>
+      </w:r>
+      <w:r>
+        <w:rPr>
+          <w:rFonts w:ascii="Times New Roman" w:hAnsi="Times New Roman"/>
+          <w:color w:val="000000"/>
+          <w:spacing w:val="-4"/>
+          <w:sz w:val="26"/>
+          <w:szCs w:val="26"/>
+          <w:lang w:val="vi-VN"/>
+        </w:rPr>
+        <w:t>........................…</w:t>
+      </w:r>
+      <w:r>
+        <w:rPr>
+          <w:rFonts w:ascii="Times New Roman" w:hAnsi="Times New Roman"/>
+          <w:color w:val="000000"/>
+          <w:spacing w:val="-4"/>
+          <w:sz w:val="26"/>
+          <w:szCs w:val="26"/>
+        </w:rPr>
+        <w:t>……</w:t>
+      </w:r>
+      <w:r>
+        <w:rPr>
+          <w:rFonts w:ascii="Times New Roman" w:hAnsi="Times New Roman"/>
+          <w:color w:val="000000"/>
+          <w:spacing w:val="-4"/>
+          <w:sz w:val="26"/>
+          <w:szCs w:val="26"/>
+        </w:rPr>
+        <w:t xml:space="preserve">…………... </w:t>
+      </w:r>
+      <w:r>
+        <w:rPr>
+          <w:rFonts w:ascii="Times New Roman" w:hAnsi="Times New Roman"/>
+          <w:color w:val="000000"/>
+          <w:spacing w:val="-4"/>
+          <w:sz w:val="26"/>
+          <w:szCs w:val="26"/>
+          <w:lang w:val="vi-VN"/>
+        </w:rPr>
+        <w:t>Tỉnh/Thành phố:……………….……</w:t>
+      </w:r>
+      <w:r>
+        <w:rPr>
+          <w:rFonts w:ascii="Times New Roman" w:hAnsi="Times New Roman"/>
+          <w:color w:val="000000"/>
+          <w:spacing w:val="-4"/>
+          <w:sz w:val="26"/>
+          <w:szCs w:val="26"/>
+        </w:rPr>
+        <w:t>…</w:t>
+      </w:r>
+      <w:r>
+        <w:rPr>
+          <w:rFonts w:ascii="Times New Roman" w:hAnsi="Times New Roman"/>
+          <w:color w:val="000000"/>
+          <w:spacing w:val="-4"/>
+          <w:sz w:val="26"/>
+          <w:szCs w:val="26"/>
+        </w:rPr>
+        <w:t>…</w:t>
+      </w:r>
+      <w:r>
+        <w:rPr>
+          <w:rFonts w:ascii="Times New Roman" w:hAnsi="Times New Roman"/>
+          <w:color w:val="000000"/>
+          <w:spacing w:val="-4"/>
+          <w:sz w:val="26"/>
+          <w:szCs w:val="26"/>
+        </w:rPr>
+        <w:t>………………..</w:t>
+      </w:r>
+      <w:r>
+        <w:rPr>
+          <w:rFonts w:ascii="Times New Roman" w:hAnsi="Times New Roman"/>
+          <w:color w:val="000000"/>
+          <w:spacing w:val="-4"/>
+          <w:sz w:val="26"/>
+          <w:szCs w:val="26"/>
+        </w:rPr>
+        <w:t>..............................................................................</w:t>
       </w:r>
     </w:p>
     <w:p>
@@ -1194,10 +2162,7 @@
         </w:rPr>
       </w:pPr>
       <w:r>
-        <w:rPr>
-          <w:rFonts w:ascii="Times New Roman" w:hAnsi="Times New Roman"/>
-        </w:rPr>
-        <w:t xml:space="preserve">Trường cấp bằng: {uni_school}  Hệ đào tạo: {uni_system}</w:t>
+        <w:t>Trường cấp bằng: {uni_school}………………………………………………………Hệ đào tạo:……………. ……….</w:t>
       </w:r>
     </w:p>
     <w:p>
@@ -1213,10 +2178,7 @@
         </w:rPr>
       </w:pPr>
       <w:r>
-        <w:rPr>
-          <w:rFonts w:ascii="Times New Roman" w:hAnsi="Times New Roman"/>
-        </w:rPr>
-        <w:t xml:space="preserve">Số hiệu bằng: {uni_number}  Số vào sổ cấp bằng: {uni_book}</w:t>
+        <w:t>Số hiệu bằng: {uni_number}……………………………………Số vào sổ cấp bằng:………………………………… .….</w:t>
       </w:r>
     </w:p>
     <w:p>
@@ -1232,10 +2194,7 @@
         </w:rPr>
       </w:pPr>
       <w:r>
-        <w:rPr>
-          <w:rFonts w:ascii="Times New Roman" w:hAnsi="Times New Roman"/>
-        </w:rPr>
-        <w:t xml:space="preserve">Ngày ký bằng: {uni_date_formatted}  Năm tốt nghiệp: {uni_year}</w:t>
+        <w:t>Ngày ký bằng: {uni_date_formatted}………………………………Năm tốt nghiệp:………………………………………….</w:t>
       </w:r>
     </w:p>
     <w:p>
@@ -1251,10 +2210,7 @@
         </w:rPr>
       </w:pPr>
       <w:r>
-        <w:rPr>
-          <w:rFonts w:ascii="Times New Roman" w:hAnsi="Times New Roman"/>
-        </w:rPr>
-        <w:t xml:space="preserve">Ngành: {major}</w:t>
+        <w:t>Ngành: {uni_major}………………………..………………….Chuyên ngành:………………………………………….</w:t>
       </w:r>
     </w:p>
     <w:p>
@@ -1270,10 +2226,7 @@
         </w:rPr>
       </w:pPr>
       <w:r>
-        <w:rPr>
-          <w:rFonts w:ascii="Times New Roman" w:hAnsi="Times New Roman"/>
-        </w:rPr>
-        <w:t xml:space="preserve">Học hàm-Học vị/Họ tên người ký bằng: {uni_signer}</w:t>
+        <w:t>Người ký bằng: {uni_signer} ………………………………………………………</w:t>
       </w:r>
     </w:p>
     <w:p>
@@ -1290,8 +2243,48 @@
       <w:r>
         <w:rPr>
           <w:rFonts w:ascii="Times New Roman" w:hAnsi="Times New Roman"/>
-        </w:rPr>
-        <w:t xml:space="preserve">Liên thông: {uni_transfer_co} Có  {uni_transfer_khong} Không</w:t>
+          <w:color w:val="000000"/>
+          <w:spacing w:val="-4"/>
+          <w:sz w:val="26"/>
+          <w:szCs w:val="26"/>
+        </w:rPr>
+        <w:t xml:space="preserve">Liên thông: </w:t>
+      </w:r>
+      <w:r>
+        <w:rPr>
+          <w:rFonts w:ascii="Times New Roman" w:hAnsi="Times New Roman"/>
+          <w:color w:val="000000"/>
+          <w:sz w:val="26"/>
+          <w:szCs w:val="26"/>
+        </w:rPr>
+        <w:sym w:font="Wingdings 2" w:char="00A3"/>
+      </w:r>
+      <w:r>
+        <w:rPr>
+          <w:rFonts w:ascii="Times New Roman" w:hAnsi="Times New Roman"/>
+          <w:color w:val="000000"/>
+          <w:sz w:val="26"/>
+          <w:szCs w:val="26"/>
+        </w:rPr>
+        <w:t xml:space="preserve"> Có      </w:t>
+      </w:r>
+      <w:r>
+        <w:rPr>
+          <w:rFonts w:ascii="Times New Roman" w:hAnsi="Times New Roman"/>
+          <w:color w:val="000000"/>
+          <w:sz w:val="26"/>
+          <w:szCs w:val="26"/>
+        </w:rPr>
+        <w:sym w:font="Wingdings 2" w:char="00A3"/>
+      </w:r>
+      <w:r>
+        <w:rPr>
+          <w:rFonts w:ascii="Times New Roman" w:hAnsi="Times New Roman"/>
+          <w:color w:val="000000"/>
+          <w:sz w:val="26"/>
+          <w:szCs w:val="26"/>
+        </w:rPr>
+        <w:t xml:space="preserve"> Không</w:t>
       </w:r>
     </w:p>
     <w:p>
@@ -1882,12 +2875,6 @@
                 <w:lang w:val="pt-BR"/>
               </w:rPr>
             </w:pPr>
-            <w:r>
-              <w:rPr>
-                <w:rFonts w:ascii="Times New Roman" w:hAnsi="Times New Roman"/>
-              </w:rPr>
-              <w:t xml:space="preserve">{#educationHistory}{timeRange}</w:t>
-            </w:r>
           </w:p>
         </w:tc>
         <w:tc>
@@ -1911,12 +2898,6 @@
                 <w:szCs w:val="26"/>
               </w:rPr>
             </w:pPr>
-            <w:r>
-              <w:rPr>
-                <w:rFonts w:ascii="Times New Roman" w:hAnsi="Times New Roman"/>
-              </w:rPr>
-              <w:t xml:space="preserve">{schoolName}</w:t>
-            </w:r>
           </w:p>
         </w:tc>
         <w:tc>
@@ -1940,12 +2921,6 @@
                 <w:lang w:val="pt-BR"/>
               </w:rPr>
             </w:pPr>
-            <w:r>
-              <w:rPr>
-                <w:rFonts w:ascii="Times New Roman" w:hAnsi="Times New Roman"/>
-              </w:rPr>
-              <w:t xml:space="preserve">{major}</w:t>
-            </w:r>
           </w:p>
         </w:tc>
         <w:tc>
@@ -1969,12 +2944,6 @@
                 <w:lang w:val="pt-BR"/>
               </w:rPr>
             </w:pPr>
-            <w:r>
-              <w:rPr>
-                <w:rFonts w:ascii="Times New Roman" w:hAnsi="Times New Roman"/>
-              </w:rPr>
-              <w:t xml:space="preserve">{learningType}</w:t>
-            </w:r>
           </w:p>
         </w:tc>
         <w:tc>
@@ -1998,12 +2967,490 @@
                 <w:lang w:val="pt-BR"/>
               </w:rPr>
             </w:pPr>
-            <w:r>
-              <w:rPr>
-                <w:rFonts w:ascii="Times New Roman" w:hAnsi="Times New Roman"/>
-              </w:rPr>
-              <w:t xml:space="preserve">{degree}{/educationHistory}</w:t>
-            </w:r>
+          </w:p>
+        </w:tc>
+      </w:tr>
+      <w:tr>
+        <w:trPr>
+          <w:trHeight w:val="907"/>
+          <w:jc w:val="center"/>
+        </w:trPr>
+        <w:tc>
+          <w:tcPr>
+            <w:tcW w:w="750" w:type="pct"/>
+            <w:vAlign w:val="center"/>
+          </w:tcPr>
+          <w:p>
+            <w:pPr>
+              <w:autoSpaceDE w:val="0"/>
+              <w:autoSpaceDN w:val="0"/>
+              <w:adjustRightInd w:val="0"/>
+              <w:spacing w:after="0" w:line="312" w:lineRule="auto"/>
+              <w:jc w:val="both"/>
+              <w:rPr>
+                <w:rFonts w:ascii="Times New Roman" w:hAnsi="Times New Roman" w:cs="Times New Roman"/>
+                <w:b/>
+                <w:bCs/>
+                <w:sz w:val="26"/>
+                <w:szCs w:val="26"/>
+                <w:lang w:val="pt-BR"/>
+              </w:rPr>
+            </w:pPr>
+          </w:p>
+        </w:tc>
+        <w:tc>
+          <w:tcPr>
+            <w:tcW w:w="1208" w:type="pct"/>
+            <w:vAlign w:val="center"/>
+          </w:tcPr>
+          <w:p>
+            <w:pPr>
+              <w:autoSpaceDE w:val="0"/>
+              <w:autoSpaceDN w:val="0"/>
+              <w:adjustRightInd w:val="0"/>
+              <w:spacing w:after="0" w:line="240" w:lineRule="auto"/>
+              <w:jc w:val="both"/>
+              <w:rPr>
+                <w:rFonts w:ascii="Times New Roman" w:hAnsi="Times New Roman" w:cs="Times New Roman"/>
+                <w:i/>
+                <w:iCs/>
+                <w:color w:val="FF0000"/>
+                <w:sz w:val="26"/>
+                <w:szCs w:val="26"/>
+              </w:rPr>
+            </w:pPr>
+          </w:p>
+        </w:tc>
+        <w:tc>
+          <w:tcPr>
+            <w:tcW w:w="997" w:type="pct"/>
+            <w:vAlign w:val="center"/>
+          </w:tcPr>
+          <w:p>
+            <w:pPr>
+              <w:autoSpaceDE w:val="0"/>
+              <w:autoSpaceDN w:val="0"/>
+              <w:adjustRightInd w:val="0"/>
+              <w:spacing w:after="0" w:line="312" w:lineRule="auto"/>
+              <w:jc w:val="both"/>
+              <w:rPr>
+                <w:rFonts w:ascii="Times New Roman" w:hAnsi="Times New Roman" w:cs="Times New Roman"/>
+                <w:b/>
+                <w:bCs/>
+                <w:sz w:val="26"/>
+                <w:szCs w:val="26"/>
+                <w:lang w:val="pt-BR"/>
+              </w:rPr>
+            </w:pPr>
+          </w:p>
+        </w:tc>
+        <w:tc>
+          <w:tcPr>
+            <w:tcW w:w="1084" w:type="pct"/>
+            <w:vAlign w:val="center"/>
+          </w:tcPr>
+          <w:p>
+            <w:pPr>
+              <w:autoSpaceDE w:val="0"/>
+              <w:autoSpaceDN w:val="0"/>
+              <w:adjustRightInd w:val="0"/>
+              <w:spacing w:after="0" w:line="312" w:lineRule="auto"/>
+              <w:jc w:val="both"/>
+              <w:rPr>
+                <w:rFonts w:ascii="Times New Roman" w:hAnsi="Times New Roman" w:cs="Times New Roman"/>
+                <w:b/>
+                <w:bCs/>
+                <w:sz w:val="26"/>
+                <w:szCs w:val="26"/>
+                <w:lang w:val="pt-BR"/>
+              </w:rPr>
+            </w:pPr>
+          </w:p>
+        </w:tc>
+        <w:tc>
+          <w:tcPr>
+            <w:tcW w:w="961" w:type="pct"/>
+            <w:vAlign w:val="center"/>
+          </w:tcPr>
+          <w:p>
+            <w:pPr>
+              <w:autoSpaceDE w:val="0"/>
+              <w:autoSpaceDN w:val="0"/>
+              <w:adjustRightInd w:val="0"/>
+              <w:spacing w:after="0" w:line="312" w:lineRule="auto"/>
+              <w:jc w:val="both"/>
+              <w:rPr>
+                <w:rFonts w:ascii="Times New Roman" w:hAnsi="Times New Roman" w:cs="Times New Roman"/>
+                <w:b/>
+                <w:bCs/>
+                <w:sz w:val="26"/>
+                <w:szCs w:val="26"/>
+                <w:lang w:val="pt-BR"/>
+              </w:rPr>
+            </w:pPr>
+          </w:p>
+        </w:tc>
+      </w:tr>
+      <w:tr>
+        <w:trPr>
+          <w:trHeight w:val="907"/>
+          <w:jc w:val="center"/>
+        </w:trPr>
+        <w:tc>
+          <w:tcPr>
+            <w:tcW w:w="750" w:type="pct"/>
+            <w:vAlign w:val="center"/>
+          </w:tcPr>
+          <w:p>
+            <w:pPr>
+              <w:autoSpaceDE w:val="0"/>
+              <w:autoSpaceDN w:val="0"/>
+              <w:adjustRightInd w:val="0"/>
+              <w:spacing w:after="0" w:line="312" w:lineRule="auto"/>
+              <w:jc w:val="both"/>
+              <w:rPr>
+                <w:rFonts w:ascii="Times New Roman" w:hAnsi="Times New Roman" w:cs="Times New Roman"/>
+                <w:b/>
+                <w:bCs/>
+                <w:sz w:val="26"/>
+                <w:szCs w:val="26"/>
+                <w:lang w:val="pt-BR"/>
+              </w:rPr>
+            </w:pPr>
+          </w:p>
+        </w:tc>
+        <w:tc>
+          <w:tcPr>
+            <w:tcW w:w="1208" w:type="pct"/>
+            <w:vAlign w:val="center"/>
+          </w:tcPr>
+          <w:p>
+            <w:pPr>
+              <w:autoSpaceDE w:val="0"/>
+              <w:autoSpaceDN w:val="0"/>
+              <w:adjustRightInd w:val="0"/>
+              <w:spacing w:after="0" w:line="240" w:lineRule="auto"/>
+              <w:jc w:val="both"/>
+              <w:rPr>
+                <w:rFonts w:ascii="Times New Roman" w:hAnsi="Times New Roman" w:cs="Times New Roman"/>
+                <w:i/>
+                <w:iCs/>
+                <w:color w:val="FF0000"/>
+                <w:sz w:val="26"/>
+                <w:szCs w:val="26"/>
+              </w:rPr>
+            </w:pPr>
+          </w:p>
+        </w:tc>
+        <w:tc>
+          <w:tcPr>
+            <w:tcW w:w="997" w:type="pct"/>
+            <w:vAlign w:val="center"/>
+          </w:tcPr>
+          <w:p>
+            <w:pPr>
+              <w:autoSpaceDE w:val="0"/>
+              <w:autoSpaceDN w:val="0"/>
+              <w:adjustRightInd w:val="0"/>
+              <w:spacing w:after="0" w:line="312" w:lineRule="auto"/>
+              <w:jc w:val="both"/>
+              <w:rPr>
+                <w:rFonts w:ascii="Times New Roman" w:hAnsi="Times New Roman" w:cs="Times New Roman"/>
+                <w:b/>
+                <w:bCs/>
+                <w:sz w:val="26"/>
+                <w:szCs w:val="26"/>
+                <w:lang w:val="pt-BR"/>
+              </w:rPr>
+            </w:pPr>
+          </w:p>
+        </w:tc>
+        <w:tc>
+          <w:tcPr>
+            <w:tcW w:w="1084" w:type="pct"/>
+            <w:vAlign w:val="center"/>
+          </w:tcPr>
+          <w:p>
+            <w:pPr>
+              <w:autoSpaceDE w:val="0"/>
+              <w:autoSpaceDN w:val="0"/>
+              <w:adjustRightInd w:val="0"/>
+              <w:spacing w:after="0" w:line="312" w:lineRule="auto"/>
+              <w:jc w:val="both"/>
+              <w:rPr>
+                <w:rFonts w:ascii="Times New Roman" w:hAnsi="Times New Roman" w:cs="Times New Roman"/>
+                <w:b/>
+                <w:bCs/>
+                <w:sz w:val="26"/>
+                <w:szCs w:val="26"/>
+                <w:lang w:val="pt-BR"/>
+              </w:rPr>
+            </w:pPr>
+          </w:p>
+        </w:tc>
+        <w:tc>
+          <w:tcPr>
+            <w:tcW w:w="961" w:type="pct"/>
+            <w:vAlign w:val="center"/>
+          </w:tcPr>
+          <w:p>
+            <w:pPr>
+              <w:autoSpaceDE w:val="0"/>
+              <w:autoSpaceDN w:val="0"/>
+              <w:adjustRightInd w:val="0"/>
+              <w:spacing w:after="0" w:line="312" w:lineRule="auto"/>
+              <w:jc w:val="both"/>
+              <w:rPr>
+                <w:rFonts w:ascii="Times New Roman" w:hAnsi="Times New Roman" w:cs="Times New Roman"/>
+                <w:b/>
+                <w:bCs/>
+                <w:sz w:val="26"/>
+                <w:szCs w:val="26"/>
+                <w:lang w:val="pt-BR"/>
+              </w:rPr>
+            </w:pPr>
+          </w:p>
+        </w:tc>
+      </w:tr>
+      <w:tr>
+        <w:trPr>
+          <w:trHeight w:val="907"/>
+          <w:jc w:val="center"/>
+        </w:trPr>
+        <w:tc>
+          <w:tcPr>
+            <w:tcW w:w="750" w:type="pct"/>
+            <w:vAlign w:val="center"/>
+          </w:tcPr>
+          <w:p>
+            <w:pPr>
+              <w:autoSpaceDE w:val="0"/>
+              <w:autoSpaceDN w:val="0"/>
+              <w:adjustRightInd w:val="0"/>
+              <w:spacing w:after="0" w:line="312" w:lineRule="auto"/>
+              <w:jc w:val="both"/>
+              <w:rPr>
+                <w:rFonts w:ascii="Times New Roman" w:hAnsi="Times New Roman" w:cs="Times New Roman"/>
+                <w:b/>
+                <w:bCs/>
+                <w:sz w:val="26"/>
+                <w:szCs w:val="26"/>
+                <w:lang w:val="pt-BR"/>
+              </w:rPr>
+            </w:pPr>
+          </w:p>
+        </w:tc>
+        <w:tc>
+          <w:tcPr>
+            <w:tcW w:w="1208" w:type="pct"/>
+            <w:vAlign w:val="center"/>
+          </w:tcPr>
+          <w:p>
+            <w:pPr>
+              <w:autoSpaceDE w:val="0"/>
+              <w:autoSpaceDN w:val="0"/>
+              <w:adjustRightInd w:val="0"/>
+              <w:spacing w:after="0" w:line="240" w:lineRule="auto"/>
+              <w:jc w:val="both"/>
+              <w:rPr>
+                <w:rFonts w:ascii="Times New Roman" w:hAnsi="Times New Roman" w:cs="Times New Roman"/>
+                <w:i/>
+                <w:iCs/>
+                <w:color w:val="FF0000"/>
+                <w:sz w:val="26"/>
+                <w:szCs w:val="26"/>
+              </w:rPr>
+            </w:pPr>
+          </w:p>
+        </w:tc>
+        <w:tc>
+          <w:tcPr>
+            <w:tcW w:w="997" w:type="pct"/>
+            <w:vAlign w:val="center"/>
+          </w:tcPr>
+          <w:p>
+            <w:pPr>
+              <w:autoSpaceDE w:val="0"/>
+              <w:autoSpaceDN w:val="0"/>
+              <w:adjustRightInd w:val="0"/>
+              <w:spacing w:after="0" w:line="312" w:lineRule="auto"/>
+              <w:jc w:val="both"/>
+              <w:rPr>
+                <w:rFonts w:ascii="Times New Roman" w:hAnsi="Times New Roman" w:cs="Times New Roman"/>
+                <w:b/>
+                <w:bCs/>
+                <w:sz w:val="26"/>
+                <w:szCs w:val="26"/>
+                <w:lang w:val="pt-BR"/>
+              </w:rPr>
+            </w:pPr>
+          </w:p>
+        </w:tc>
+        <w:tc>
+          <w:tcPr>
+            <w:tcW w:w="1084" w:type="pct"/>
+            <w:vAlign w:val="center"/>
+          </w:tcPr>
+          <w:p>
+            <w:pPr>
+              <w:autoSpaceDE w:val="0"/>
+              <w:autoSpaceDN w:val="0"/>
+              <w:adjustRightInd w:val="0"/>
+              <w:spacing w:after="0" w:line="312" w:lineRule="auto"/>
+              <w:jc w:val="both"/>
+              <w:rPr>
+                <w:rFonts w:ascii="Times New Roman" w:hAnsi="Times New Roman" w:cs="Times New Roman"/>
+                <w:b/>
+                <w:bCs/>
+                <w:sz w:val="26"/>
+                <w:szCs w:val="26"/>
+                <w:lang w:val="pt-BR"/>
+              </w:rPr>
+            </w:pPr>
+          </w:p>
+        </w:tc>
+        <w:tc>
+          <w:tcPr>
+            <w:tcW w:w="961" w:type="pct"/>
+            <w:vAlign w:val="center"/>
+          </w:tcPr>
+          <w:p>
+            <w:pPr>
+              <w:autoSpaceDE w:val="0"/>
+              <w:autoSpaceDN w:val="0"/>
+              <w:adjustRightInd w:val="0"/>
+              <w:spacing w:after="0" w:line="312" w:lineRule="auto"/>
+              <w:jc w:val="both"/>
+              <w:rPr>
+                <w:rFonts w:ascii="Times New Roman" w:hAnsi="Times New Roman" w:cs="Times New Roman"/>
+                <w:b/>
+                <w:bCs/>
+                <w:sz w:val="26"/>
+                <w:szCs w:val="26"/>
+                <w:lang w:val="pt-BR"/>
+              </w:rPr>
+            </w:pPr>
+          </w:p>
+        </w:tc>
+      </w:tr>
+      <w:tr>
+        <w:trPr>
+          <w:trHeight w:val="907"/>
+          <w:jc w:val="center"/>
+        </w:trPr>
+        <w:tc>
+          <w:tcPr>
+            <w:tcW w:w="750" w:type="pct"/>
+            <w:vAlign w:val="center"/>
+          </w:tcPr>
+          <w:p>
+            <w:pPr>
+              <w:autoSpaceDE w:val="0"/>
+              <w:autoSpaceDN w:val="0"/>
+              <w:adjustRightInd w:val="0"/>
+              <w:spacing w:after="0" w:line="312" w:lineRule="auto"/>
+              <w:jc w:val="both"/>
+              <w:rPr>
+                <w:rFonts w:ascii="Times New Roman" w:hAnsi="Times New Roman" w:cs="Times New Roman"/>
+                <w:b/>
+                <w:bCs/>
+                <w:sz w:val="26"/>
+                <w:szCs w:val="26"/>
+                <w:lang w:val="pt-BR"/>
+              </w:rPr>
+            </w:pPr>
+          </w:p>
+        </w:tc>
+        <w:tc>
+          <w:tcPr>
+            <w:tcW w:w="1208" w:type="pct"/>
+            <w:vAlign w:val="center"/>
+          </w:tcPr>
+          <w:p>
+            <w:pPr>
+              <w:autoSpaceDE w:val="0"/>
+              <w:autoSpaceDN w:val="0"/>
+              <w:adjustRightInd w:val="0"/>
+              <w:spacing w:after="0" w:line="312" w:lineRule="auto"/>
+              <w:jc w:val="both"/>
+              <w:rPr>
+                <w:rFonts w:ascii="Times New Roman" w:hAnsi="Times New Roman" w:cs="Times New Roman"/>
+                <w:b/>
+                <w:bCs/>
+                <w:sz w:val="26"/>
+                <w:szCs w:val="26"/>
+                <w:lang w:val="pt-BR"/>
+              </w:rPr>
+            </w:pPr>
+          </w:p>
+        </w:tc>
+        <w:tc>
+          <w:tcPr>
+            <w:tcW w:w="997" w:type="pct"/>
+            <w:vAlign w:val="center"/>
+          </w:tcPr>
+          <w:p>
+            <w:pPr>
+              <w:autoSpaceDE w:val="0"/>
+              <w:autoSpaceDN w:val="0"/>
+              <w:adjustRightInd w:val="0"/>
+              <w:spacing w:after="0" w:line="312" w:lineRule="auto"/>
+              <w:jc w:val="both"/>
+              <w:rPr>
+                <w:rFonts w:ascii="Times New Roman" w:hAnsi="Times New Roman" w:cs="Times New Roman"/>
+                <w:b/>
+                <w:bCs/>
+                <w:sz w:val="26"/>
+                <w:szCs w:val="26"/>
+                <w:lang w:val="pt-BR"/>
+              </w:rPr>
+            </w:pPr>
+          </w:p>
+        </w:tc>
+        <w:tc>
+          <w:tcPr>
+            <w:tcW w:w="1084" w:type="pct"/>
+            <w:vAlign w:val="center"/>
+          </w:tcPr>
+          <w:p>
+            <w:pPr>
+              <w:autoSpaceDE w:val="0"/>
+              <w:autoSpaceDN w:val="0"/>
+              <w:adjustRightInd w:val="0"/>
+              <w:spacing w:after="0" w:line="312" w:lineRule="auto"/>
+              <w:jc w:val="both"/>
+              <w:rPr>
+                <w:rFonts w:ascii="Times New Roman" w:hAnsi="Times New Roman" w:cs="Times New Roman"/>
+                <w:b/>
+                <w:bCs/>
+                <w:sz w:val="26"/>
+                <w:szCs w:val="26"/>
+                <w:lang w:val="pt-BR"/>
+              </w:rPr>
+            </w:pPr>
+          </w:p>
+        </w:tc>
+        <w:tc>
+          <w:tcPr>
+            <w:tcW w:w="961" w:type="pct"/>
+            <w:vAlign w:val="center"/>
+          </w:tcPr>
+          <w:p>
+            <w:pPr>
+              <w:autoSpaceDE w:val="0"/>
+              <w:autoSpaceDN w:val="0"/>
+              <w:adjustRightInd w:val="0"/>
+              <w:spacing w:after="0" w:line="312" w:lineRule="auto"/>
+              <w:jc w:val="both"/>
+              <w:rPr>
+                <w:rFonts w:ascii="Times New Roman" w:hAnsi="Times New Roman" w:cs="Times New Roman"/>
+                <w:b/>
+                <w:bCs/>
+                <w:sz w:val="26"/>
+                <w:szCs w:val="26"/>
+                <w:lang w:val="pt-BR"/>
+              </w:rPr>
+            </w:pPr>
           </w:p>
         </w:tc>
       </w:tr>
@@ -2315,12 +3762,6 @@
                 <w:lang w:val="en-US" w:eastAsia="en-US"/>
               </w:rPr>
             </w:pPr>
-            <w:r>
-              <w:rPr>
-                <w:rFonts w:ascii="Times New Roman" w:hAnsi="Times New Roman"/>
-              </w:rPr>
-              <w:t xml:space="preserve">{#workHistory}{timeRange}</w:t>
-            </w:r>
           </w:p>
         </w:tc>
         <w:tc>
@@ -2338,12 +3779,6 @@
                 <w:lang w:val="en-US" w:eastAsia="en-US"/>
               </w:rPr>
             </w:pPr>
-            <w:r>
-              <w:rPr>
-                <w:rFonts w:ascii="Times New Roman" w:hAnsi="Times New Roman"/>
-              </w:rPr>
-              <w:t xml:space="preserve">{organization}</w:t>
-            </w:r>
           </w:p>
         </w:tc>
         <w:tc>
@@ -2361,12 +3796,120 @@
                 <w:lang w:val="en-US" w:eastAsia="en-US"/>
               </w:rPr>
             </w:pPr>
-            <w:r>
-              <w:rPr>
-                <w:rFonts w:ascii="Times New Roman" w:hAnsi="Times New Roman"/>
-              </w:rPr>
-              <w:t xml:space="preserve">{position}{/workHistory}</w:t>
-            </w:r>
+          </w:p>
+        </w:tc>
+      </w:tr>
+      <w:tr>
+        <w:trPr>
+          <w:trHeight w:val="907"/>
+          <w:jc w:val="center"/>
+        </w:trPr>
+        <w:tc>
+          <w:tcPr>
+            <w:tcW w:w="925" w:type="pct"/>
+          </w:tcPr>
+          <w:p>
+            <w:pPr>
+              <w:pStyle w:val="BodyText"/>
+              <w:ind w:left="360"/>
+              <w:rPr>
+                <w:rFonts w:ascii="Times New Roman" w:hAnsi="Times New Roman"/>
+                <w:sz w:val="26"/>
+                <w:szCs w:val="26"/>
+                <w:lang w:val="en-US" w:eastAsia="en-US"/>
+              </w:rPr>
+            </w:pPr>
+          </w:p>
+        </w:tc>
+        <w:tc>
+          <w:tcPr>
+            <w:tcW w:w="2779" w:type="pct"/>
+          </w:tcPr>
+          <w:p>
+            <w:pPr>
+              <w:pStyle w:val="BodyText"/>
+              <w:ind w:left="360"/>
+              <w:rPr>
+                <w:rFonts w:ascii="Times New Roman" w:hAnsi="Times New Roman"/>
+                <w:sz w:val="26"/>
+                <w:szCs w:val="26"/>
+                <w:lang w:val="en-US" w:eastAsia="en-US"/>
+              </w:rPr>
+            </w:pPr>
+          </w:p>
+        </w:tc>
+        <w:tc>
+          <w:tcPr>
+            <w:tcW w:w="1295" w:type="pct"/>
+          </w:tcPr>
+          <w:p>
+            <w:pPr>
+              <w:pStyle w:val="BodyText"/>
+              <w:ind w:left="360"/>
+              <w:rPr>
+                <w:rFonts w:ascii="Times New Roman" w:hAnsi="Times New Roman"/>
+                <w:sz w:val="26"/>
+                <w:szCs w:val="26"/>
+                <w:lang w:val="en-US" w:eastAsia="en-US"/>
+              </w:rPr>
+            </w:pPr>
+          </w:p>
+        </w:tc>
+      </w:tr>
+      <w:tr>
+        <w:trPr>
+          <w:trHeight w:val="907"/>
+          <w:jc w:val="center"/>
+        </w:trPr>
+        <w:tc>
+          <w:tcPr>
+            <w:tcW w:w="925" w:type="pct"/>
+          </w:tcPr>
+          <w:p>
+            <w:pPr>
+              <w:pStyle w:val="BodyText"/>
+              <w:ind w:left="360"/>
+              <w:rPr>
+                <w:rFonts w:ascii="Times New Roman" w:hAnsi="Times New Roman"/>
+                <w:sz w:val="26"/>
+                <w:szCs w:val="26"/>
+                <w:lang w:val="en-US" w:eastAsia="en-US"/>
+              </w:rPr>
+            </w:pPr>
+          </w:p>
+        </w:tc>
+        <w:tc>
+          <w:tcPr>
+            <w:tcW w:w="2779" w:type="pct"/>
+          </w:tcPr>
+          <w:p>
+            <w:pPr>
+              <w:pStyle w:val="BodyText"/>
+              <w:ind w:left="360"/>
+              <w:rPr>
+                <w:rFonts w:ascii="Times New Roman" w:hAnsi="Times New Roman"/>
+                <w:sz w:val="26"/>
+                <w:szCs w:val="26"/>
+                <w:lang w:val="en-US" w:eastAsia="en-US"/>
+              </w:rPr>
+            </w:pPr>
+          </w:p>
+        </w:tc>
+        <w:tc>
+          <w:tcPr>
+            <w:tcW w:w="1295" w:type="pct"/>
+          </w:tcPr>
+          <w:p>
+            <w:pPr>
+              <w:pStyle w:val="BodyText"/>
+              <w:ind w:left="360"/>
+              <w:rPr>
+                <w:rFonts w:ascii="Times New Roman" w:hAnsi="Times New Roman"/>
+                <w:sz w:val="26"/>
+                <w:szCs w:val="26"/>
+                <w:lang w:val="en-US" w:eastAsia="en-US"/>
+              </w:rPr>
+            </w:pPr>
           </w:p>
         </w:tc>
       </w:tr>
@@ -2430,9 +3973,21 @@
       </w:pPr>
       <w:r>
         <w:rPr>
-          <w:rFonts w:ascii="Times New Roman" w:hAnsi="Times New Roman"/>
-        </w:rPr>
-        <w:t xml:space="preserve">{#scientificWorks}</w:t>
+          <w:rFonts w:ascii="Times New Roman" w:hAnsi="Times New Roman" w:cs="Times New Roman"/>
+          <w:bCs/>
+          <w:sz w:val="26"/>
+          <w:szCs w:val="26"/>
+        </w:rPr>
+        <w:t>…………………………………………………………………………………………………………</w:t>
+      </w:r>
+      <w:r>
+        <w:rPr>
+          <w:rFonts w:ascii="Times New Roman" w:hAnsi="Times New Roman" w:cs="Times New Roman"/>
+          <w:bCs/>
+          <w:sz w:val="26"/>
+          <w:szCs w:val="26"/>
+        </w:rPr>
+        <w:t>.</w:t>
       </w:r>
     </w:p>
     <w:p>
@@ -2449,9 +4004,21 @@
       </w:pPr>
       <w:r>
         <w:rPr>
-          <w:rFonts w:ascii="Times New Roman" w:hAnsi="Times New Roman"/>
-        </w:rPr>
-        <w:t xml:space="preserve">- {this}</w:t>
+          <w:rFonts w:ascii="Times New Roman" w:hAnsi="Times New Roman" w:cs="Times New Roman"/>
+          <w:bCs/>
+          <w:sz w:val="26"/>
+          <w:szCs w:val="26"/>
+        </w:rPr>
+        <w:t>…………………………………………………………………………………………………………</w:t>
+      </w:r>
+      <w:r>
+        <w:rPr>
+          <w:rFonts w:ascii="Times New Roman" w:hAnsi="Times New Roman" w:cs="Times New Roman"/>
+          <w:bCs/>
+          <w:sz w:val="26"/>
+          <w:szCs w:val="26"/>
+        </w:rPr>
+        <w:t>.</w:t>
       </w:r>
     </w:p>
     <w:p>
@@ -2468,9 +4035,12 @@
       </w:pPr>
       <w:r>
         <w:rPr>
-          <w:rFonts w:ascii="Times New Roman" w:hAnsi="Times New Roman"/>
-        </w:rPr>
-        <w:t xml:space="preserve">{/scientificWorks}</w:t>
+          <w:rFonts w:ascii="Times New Roman" w:hAnsi="Times New Roman" w:cs="Times New Roman"/>
+          <w:bCs/>
+          <w:sz w:val="26"/>
+          <w:szCs w:val="26"/>
+        </w:rPr>
+        <w:t>………………………………………………………………………………………………………….</w:t>
       </w:r>
     </w:p>
     <w:p>
@@ -2548,9 +4118,39 @@
       </w:pPr>
       <w:r>
         <w:rPr>
-          <w:rFonts w:ascii="Times New Roman" w:hAnsi="Times New Roman"/>
-        </w:rPr>
-        <w:t xml:space="preserve">Khen thưởng: {rewards}</w:t>
+          <w:rFonts w:ascii="Times New Roman" w:hAnsi="Times New Roman" w:cs="Times New Roman"/>
+          <w:b/>
+          <w:sz w:val="26"/>
+          <w:szCs w:val="26"/>
+        </w:rPr>
+        <w:t>Khen thưởng:</w:t>
+      </w:r>
+      <w:r>
+        <w:rPr>
+          <w:rFonts w:ascii="Times New Roman" w:hAnsi="Times New Roman" w:cs="Times New Roman"/>
+          <w:b/>
+          <w:sz w:val="26"/>
+          <w:szCs w:val="26"/>
+        </w:rPr>
+        <w:t xml:space="preserve"> </w:t>
+      </w:r>
+      <w:r>
+        <w:rPr>
+          <w:rFonts w:ascii="Times New Roman" w:hAnsi="Times New Roman" w:cs="Times New Roman"/>
+          <w:bCs/>
+          <w:sz w:val="26"/>
+          <w:szCs w:val="26"/>
+        </w:rPr>
+        <w:t>………………………………………………………………………………….……</w:t>
+      </w:r>
+      <w:r>
+        <w:rPr>
+          <w:rFonts w:ascii="Times New Roman" w:hAnsi="Times New Roman" w:cs="Times New Roman"/>
+          <w:bCs/>
+          <w:sz w:val="26"/>
+          <w:szCs w:val="26"/>
+        </w:rPr>
+        <w:t>...</w:t>
       </w:r>
     </w:p>
     <w:p>
@@ -2567,9 +4167,21 @@
       </w:pPr>
       <w:r>
         <w:rPr>
-          <w:rFonts w:ascii="Times New Roman" w:hAnsi="Times New Roman"/>
-        </w:rPr>
-        <w:t xml:space="preserve"/>
+          <w:rFonts w:ascii="Times New Roman" w:hAnsi="Times New Roman" w:cs="Times New Roman"/>
+          <w:bCs/>
+          <w:sz w:val="26"/>
+          <w:szCs w:val="26"/>
+        </w:rPr>
+        <w:t>…………………………………………………………………………………………………………</w:t>
+      </w:r>
+      <w:r>
+        <w:rPr>
+          <w:rFonts w:ascii="Times New Roman" w:hAnsi="Times New Roman" w:cs="Times New Roman"/>
+          <w:bCs/>
+          <w:sz w:val="26"/>
+          <w:szCs w:val="26"/>
+        </w:rPr>
+        <w:t>.</w:t>
       </w:r>
     </w:p>
     <w:p>
@@ -2586,9 +4198,59 @@
       </w:pPr>
       <w:r>
         <w:rPr>
-          <w:rFonts w:ascii="Times New Roman" w:hAnsi="Times New Roman"/>
-        </w:rPr>
-        <w:t xml:space="preserve">Kỷ luật: {discipline}</w:t>
+          <w:rFonts w:ascii="Times New Roman" w:hAnsi="Times New Roman" w:cs="Times New Roman"/>
+          <w:b/>
+          <w:sz w:val="26"/>
+          <w:szCs w:val="26"/>
+        </w:rPr>
+        <w:t>Kỷ luật</w:t>
+      </w:r>
+      <w:r>
+        <w:rPr>
+          <w:rFonts w:ascii="Times New Roman" w:hAnsi="Times New Roman" w:cs="Times New Roman"/>
+          <w:bCs/>
+          <w:sz w:val="26"/>
+          <w:szCs w:val="26"/>
+        </w:rPr>
+        <w:t>:</w:t>
+      </w:r>
+      <w:r>
+        <w:rPr>
+          <w:rFonts w:ascii="Times New Roman" w:hAnsi="Times New Roman" w:cs="Times New Roman"/>
+          <w:bCs/>
+          <w:sz w:val="26"/>
+          <w:szCs w:val="26"/>
+        </w:rPr>
+        <w:t xml:space="preserve"> </w:t>
+      </w:r>
+      <w:r>
+        <w:rPr>
+          <w:rFonts w:ascii="Times New Roman" w:hAnsi="Times New Roman" w:cs="Times New Roman"/>
+          <w:bCs/>
+          <w:sz w:val="26"/>
+          <w:szCs w:val="26"/>
+        </w:rPr>
+        <w:t>……………………………………………………………………………………</w:t>
+      </w:r>
+      <w:proofErr w:type="gramStart"/>
+      <w:r>
+        <w:rPr>
+          <w:rFonts w:ascii="Times New Roman" w:hAnsi="Times New Roman" w:cs="Times New Roman"/>
+          <w:bCs/>
+          <w:sz w:val="26"/>
+          <w:szCs w:val="26"/>
+        </w:rPr>
+        <w:t>…..</w:t>
+      </w:r>
+      <w:proofErr w:type="gramEnd"/>
+      <w:r>
+        <w:rPr>
+          <w:rFonts w:ascii="Times New Roman" w:hAnsi="Times New Roman" w:cs="Times New Roman"/>
+          <w:bCs/>
+          <w:sz w:val="26"/>
+          <w:szCs w:val="26"/>
+        </w:rPr>
+        <w:t>………</w:t>
       </w:r>
     </w:p>
     <w:p>
@@ -2605,9 +4267,21 @@
       </w:pPr>
       <w:r>
         <w:rPr>
-          <w:rFonts w:ascii="Times New Roman" w:hAnsi="Times New Roman"/>
-        </w:rPr>
-        <w:t xml:space="preserve"/>
+          <w:rFonts w:ascii="Times New Roman" w:hAnsi="Times New Roman" w:cs="Times New Roman"/>
+          <w:bCs/>
+          <w:sz w:val="26"/>
+          <w:szCs w:val="26"/>
+        </w:rPr>
+        <w:t>…………………………………………………………………………………………………………</w:t>
+      </w:r>
+      <w:r>
+        <w:rPr>
+          <w:rFonts w:ascii="Times New Roman" w:hAnsi="Times New Roman" w:cs="Times New Roman"/>
+          <w:bCs/>
+          <w:sz w:val="26"/>
+          <w:szCs w:val="26"/>
+        </w:rPr>
+        <w:t>.</w:t>
       </w:r>
     </w:p>
     <w:p>
@@ -2710,8 +4384,110 @@
       <w:r>
         <w:rPr>
           <w:rFonts w:ascii="Times New Roman" w:hAnsi="Times New Roman"/>
-        </w:rPr>
-        <w:t xml:space="preserve">- Họ và tên CHA: {father_name}  Ngày sinh: {father_yob}</w:t>
+          <w:b/>
+          <w:color w:val="000000"/>
+          <w:sz w:val="26"/>
+          <w:szCs w:val="26"/>
+          <w:lang w:val="vi-VN"/>
+        </w:rPr>
+        <w:t xml:space="preserve">- Họ và tên </w:t>
+      </w:r>
+      <w:r>
+        <w:rPr>
+          <w:rFonts w:ascii="Times New Roman" w:hAnsi="Times New Roman"/>
+          <w:b/>
+          <w:color w:val="000000"/>
+          <w:sz w:val="26"/>
+          <w:szCs w:val="26"/>
+        </w:rPr>
+        <w:t>CHA</w:t>
+      </w:r>
+      <w:r>
+        <w:rPr>
+          <w:rFonts w:ascii="Times New Roman" w:hAnsi="Times New Roman"/>
+          <w:color w:val="000000"/>
+          <w:sz w:val="26"/>
+          <w:szCs w:val="26"/>
+          <w:lang w:val="vi-VN"/>
+        </w:rPr>
+        <w:t>:.................................…….........................</w:t>
+      </w:r>
+      <w:r>
+        <w:rPr>
+          <w:rFonts w:ascii="Times New Roman" w:hAnsi="Times New Roman"/>
+          <w:color w:val="000000"/>
+          <w:sz w:val="26"/>
+          <w:szCs w:val="26"/>
+        </w:rPr>
+        <w:t>...........</w:t>
+      </w:r>
+      <w:r>
+        <w:rPr>
+          <w:rFonts w:ascii="Times New Roman" w:hAnsi="Times New Roman"/>
+          <w:color w:val="000000"/>
+          <w:sz w:val="26"/>
+          <w:szCs w:val="26"/>
+        </w:rPr>
+        <w:t>N</w:t>
+      </w:r>
+      <w:r>
+        <w:rPr>
+          <w:rFonts w:ascii="Times New Roman" w:hAnsi="Times New Roman"/>
+          <w:color w:val="000000"/>
+          <w:sz w:val="26"/>
+          <w:szCs w:val="26"/>
+          <w:lang w:val="vi-VN"/>
+        </w:rPr>
+        <w:t>gày</w:t>
+      </w:r>
+      <w:r>
+        <w:rPr>
+          <w:rFonts w:ascii="Times New Roman" w:hAnsi="Times New Roman"/>
+          <w:color w:val="000000"/>
+          <w:sz w:val="26"/>
+          <w:szCs w:val="26"/>
+        </w:rPr>
+        <w:t xml:space="preserve"> </w:t>
+      </w:r>
+      <w:proofErr w:type="gramStart"/>
+      <w:r>
+        <w:rPr>
+          <w:rFonts w:ascii="Times New Roman" w:hAnsi="Times New Roman"/>
+          <w:color w:val="000000"/>
+          <w:sz w:val="26"/>
+          <w:szCs w:val="26"/>
+        </w:rPr>
+        <w:t>sinh</w:t>
+      </w:r>
+      <w:r>
+        <w:rPr>
+          <w:rFonts w:ascii="Times New Roman" w:hAnsi="Times New Roman"/>
+          <w:color w:val="000000"/>
+          <w:sz w:val="26"/>
+          <w:szCs w:val="26"/>
+          <w:lang w:val="vi-VN"/>
+        </w:rPr>
+        <w:t>:........</w:t>
+      </w:r>
+      <w:proofErr w:type="gramEnd"/>
+      <w:r>
+        <w:rPr>
+          <w:rFonts w:ascii="Times New Roman" w:hAnsi="Times New Roman"/>
+          <w:color w:val="000000"/>
+          <w:sz w:val="26"/>
+          <w:szCs w:val="26"/>
+          <w:lang w:val="vi-VN"/>
+        </w:rPr>
+        <w:t>…...............</w:t>
+      </w:r>
+      <w:r>
+        <w:rPr>
+          <w:rFonts w:ascii="Times New Roman" w:hAnsi="Times New Roman"/>
+          <w:color w:val="000000"/>
+          <w:sz w:val="26"/>
+          <w:szCs w:val="26"/>
+        </w:rPr>
+        <w:t>.........</w:t>
       </w:r>
     </w:p>
     <w:p>
@@ -2729,8 +4505,109 @@
       <w:r>
         <w:rPr>
           <w:rFonts w:ascii="Times New Roman" w:hAnsi="Times New Roman"/>
-        </w:rPr>
-        <w:t xml:space="preserve">- Số điện thoại: {father_phone}  Nghề nghiệp: {father_job}</w:t>
+          <w:color w:val="000000"/>
+          <w:sz w:val="26"/>
+          <w:szCs w:val="26"/>
+        </w:rPr>
+        <w:t xml:space="preserve">- </w:t>
+      </w:r>
+      <w:r>
+        <w:rPr>
+          <w:rFonts w:ascii="Times New Roman" w:hAnsi="Times New Roman"/>
+          <w:color w:val="000000"/>
+          <w:sz w:val="26"/>
+          <w:szCs w:val="26"/>
+          <w:lang w:val="vi-VN"/>
+        </w:rPr>
+        <w:t xml:space="preserve">Số điện </w:t>
+      </w:r>
+      <w:proofErr w:type="gramStart"/>
+      <w:r>
+        <w:rPr>
+          <w:rFonts w:ascii="Times New Roman" w:hAnsi="Times New Roman"/>
+          <w:color w:val="000000"/>
+          <w:sz w:val="26"/>
+          <w:szCs w:val="26"/>
+          <w:lang w:val="vi-VN"/>
+        </w:rPr>
+        <w:t>thoại</w:t>
+      </w:r>
+      <w:r>
+        <w:rPr>
+          <w:rFonts w:ascii="Times New Roman" w:hAnsi="Times New Roman"/>
+          <w:color w:val="000000"/>
+          <w:sz w:val="26"/>
+          <w:szCs w:val="26"/>
+        </w:rPr>
+        <w:t>:</w:t>
+      </w:r>
+      <w:r>
+        <w:rPr>
+          <w:rFonts w:ascii="Times New Roman" w:hAnsi="Times New Roman"/>
+          <w:color w:val="000000"/>
+          <w:sz w:val="26"/>
+          <w:szCs w:val="26"/>
+          <w:lang w:val="vi-VN"/>
+        </w:rPr>
+        <w:t>…</w:t>
+      </w:r>
+      <w:proofErr w:type="gramEnd"/>
+      <w:r>
+        <w:rPr>
+          <w:rFonts w:ascii="Times New Roman" w:hAnsi="Times New Roman"/>
+          <w:color w:val="000000"/>
+          <w:sz w:val="26"/>
+          <w:szCs w:val="26"/>
+          <w:lang w:val="vi-VN"/>
+        </w:rPr>
+        <w:t>…………………</w:t>
+      </w:r>
+      <w:r>
+        <w:rPr>
+          <w:rFonts w:ascii="Times New Roman" w:hAnsi="Times New Roman"/>
+          <w:color w:val="000000"/>
+          <w:sz w:val="26"/>
+          <w:szCs w:val="26"/>
+          <w:lang w:val="vi-VN"/>
+        </w:rPr>
+        <w:t>…</w:t>
+      </w:r>
+      <w:r>
+        <w:rPr>
+          <w:rFonts w:ascii="Times New Roman" w:hAnsi="Times New Roman"/>
+          <w:color w:val="000000"/>
+          <w:sz w:val="26"/>
+          <w:szCs w:val="26"/>
+        </w:rPr>
+        <w:t>……………</w:t>
+      </w:r>
+      <w:r>
+        <w:rPr>
+          <w:rFonts w:ascii="Times New Roman" w:hAnsi="Times New Roman"/>
+          <w:color w:val="000000"/>
+          <w:sz w:val="26"/>
+          <w:szCs w:val="26"/>
+        </w:rPr>
+        <w:t>.</w:t>
+      </w:r>
+      <w:r>
+        <w:rPr>
+          <w:rFonts w:ascii="Times New Roman" w:hAnsi="Times New Roman"/>
+          <w:color w:val="000000"/>
+          <w:sz w:val="26"/>
+          <w:szCs w:val="26"/>
+          <w:lang w:val="vi-VN"/>
+        </w:rPr>
+        <w:t>Nghề nghiệp:..............……......................</w:t>
+      </w:r>
+      <w:r>
+        <w:rPr>
+          <w:rFonts w:ascii="Times New Roman" w:hAnsi="Times New Roman"/>
+          <w:color w:val="000000"/>
+          <w:sz w:val="26"/>
+          <w:szCs w:val="26"/>
+        </w:rPr>
+        <w:t>.............</w:t>
       </w:r>
     </w:p>
     <w:p>
@@ -2748,9 +4625,43 @@
       <w:r>
         <w:rPr>
           <w:rFonts w:ascii="Times New Roman" w:hAnsi="Times New Roman"/>
-        </w:rPr>
-        <w:t xml:space="preserve">- Địa chỉ thường trú: {father_address}</w:t>
-      </w:r>
+          <w:color w:val="000000"/>
+          <w:sz w:val="26"/>
+          <w:szCs w:val="26"/>
+        </w:rPr>
+        <w:t xml:space="preserve">- </w:t>
+      </w:r>
+      <w:r>
+        <w:rPr>
+          <w:rFonts w:ascii="Times New Roman" w:hAnsi="Times New Roman"/>
+          <w:color w:val="000000"/>
+          <w:sz w:val="26"/>
+          <w:szCs w:val="26"/>
+          <w:lang w:val="vi-VN"/>
+        </w:rPr>
+        <w:t xml:space="preserve">Địa chỉ thường </w:t>
+      </w:r>
+      <w:proofErr w:type="gramStart"/>
+      <w:r>
+        <w:rPr>
+          <w:rFonts w:ascii="Times New Roman" w:hAnsi="Times New Roman"/>
+          <w:color w:val="000000"/>
+          <w:sz w:val="26"/>
+          <w:szCs w:val="26"/>
+          <w:lang w:val="vi-VN"/>
+        </w:rPr>
+        <w:t>trú:.........................................................</w:t>
+      </w:r>
+      <w:r>
+        <w:rPr>
+          <w:rFonts w:ascii="Times New Roman" w:hAnsi="Times New Roman"/>
+          <w:color w:val="000000"/>
+          <w:sz w:val="26"/>
+          <w:szCs w:val="26"/>
+        </w:rPr>
+        <w:t>.......................................................................</w:t>
+      </w:r>
+      <w:proofErr w:type="gramEnd"/>
     </w:p>
     <w:p>
       <w:pPr>
@@ -2766,8 +4677,146 @@
       <w:r>
         <w:rPr>
           <w:rFonts w:ascii="Times New Roman" w:hAnsi="Times New Roman"/>
-        </w:rPr>
-        <w:t xml:space="preserve">- Trình độ học vấn: {father_edu_sdh} Sau đại học  {father_edu_dh} Đại học  {father_edu_cd} Cao đẳng  {father_edu_tc} Trung cấp</w:t>
+          <w:color w:val="000000"/>
+          <w:sz w:val="26"/>
+          <w:szCs w:val="26"/>
+        </w:rPr>
+        <w:t xml:space="preserve">- </w:t>
+      </w:r>
+      <w:r>
+        <w:rPr>
+          <w:rFonts w:ascii="Times New Roman" w:hAnsi="Times New Roman"/>
+          <w:color w:val="000000"/>
+          <w:sz w:val="26"/>
+          <w:szCs w:val="26"/>
+        </w:rPr>
+        <w:t xml:space="preserve">Trình độ học vấn:  </w:t>
+      </w:r>
+      <w:r>
+        <w:rPr>
+          <w:rFonts w:ascii="Times New Roman" w:hAnsi="Times New Roman"/>
+          <w:color w:val="000000"/>
+          <w:sz w:val="26"/>
+          <w:szCs w:val="26"/>
+        </w:rPr>
+        <w:sym w:font="Wingdings 2" w:char="00A3"/>
+      </w:r>
+      <w:r>
+        <w:rPr>
+          <w:rFonts w:ascii="Times New Roman" w:hAnsi="Times New Roman"/>
+          <w:color w:val="000000"/>
+          <w:sz w:val="26"/>
+          <w:szCs w:val="26"/>
+        </w:rPr>
+        <w:t xml:space="preserve"> Sau đại học </w:t>
+      </w:r>
+      <w:r>
+        <w:rPr>
+          <w:rFonts w:ascii="Times New Roman" w:hAnsi="Times New Roman"/>
+          <w:color w:val="000000"/>
+          <w:sz w:val="26"/>
+          <w:szCs w:val="26"/>
+        </w:rPr>
+        <w:tab/>
+      </w:r>
+      <w:r>
+        <w:rPr>
+          <w:rFonts w:ascii="Times New Roman" w:hAnsi="Times New Roman"/>
+          <w:color w:val="000000"/>
+          <w:sz w:val="26"/>
+          <w:szCs w:val="26"/>
+        </w:rPr>
+        <w:sym w:font="Wingdings 2" w:char="00A3"/>
+      </w:r>
+      <w:r>
+        <w:rPr>
+          <w:rFonts w:ascii="Times New Roman" w:hAnsi="Times New Roman"/>
+          <w:color w:val="000000"/>
+          <w:sz w:val="26"/>
+          <w:szCs w:val="26"/>
+        </w:rPr>
+        <w:t xml:space="preserve"> Đại học</w:t>
+      </w:r>
+      <w:r>
+        <w:rPr>
+          <w:rFonts w:ascii="Times New Roman" w:hAnsi="Times New Roman"/>
+          <w:color w:val="000000"/>
+          <w:sz w:val="26"/>
+          <w:szCs w:val="26"/>
+        </w:rPr>
+        <w:t xml:space="preserve">  </w:t>
+      </w:r>
+      <w:r>
+        <w:rPr>
+          <w:rFonts w:ascii="Times New Roman" w:hAnsi="Times New Roman"/>
+          <w:color w:val="000000"/>
+          <w:sz w:val="26"/>
+          <w:szCs w:val="26"/>
+        </w:rPr>
+        <w:t xml:space="preserve">     </w:t>
+      </w:r>
+      <w:r>
+        <w:rPr>
+          <w:rFonts w:ascii="Times New Roman" w:hAnsi="Times New Roman"/>
+          <w:color w:val="000000"/>
+          <w:sz w:val="26"/>
+          <w:szCs w:val="26"/>
+        </w:rPr>
+        <w:t xml:space="preserve">   </w:t>
+      </w:r>
+      <w:r>
+        <w:rPr>
+          <w:rFonts w:ascii="Times New Roman" w:hAnsi="Times New Roman"/>
+          <w:color w:val="000000"/>
+          <w:sz w:val="26"/>
+          <w:szCs w:val="26"/>
+        </w:rPr>
+        <w:sym w:font="Wingdings 2" w:char="00A3"/>
+      </w:r>
+      <w:r>
+        <w:rPr>
+          <w:rFonts w:ascii="Times New Roman" w:hAnsi="Times New Roman"/>
+          <w:color w:val="000000"/>
+          <w:sz w:val="26"/>
+          <w:szCs w:val="26"/>
+        </w:rPr>
+        <w:t xml:space="preserve"> Cao đẳng       </w:t>
+      </w:r>
+      <w:r>
+        <w:rPr>
+          <w:rFonts w:ascii="Times New Roman" w:hAnsi="Times New Roman"/>
+          <w:color w:val="000000"/>
+          <w:sz w:val="26"/>
+          <w:szCs w:val="26"/>
+        </w:rPr>
+        <w:sym w:font="Wingdings 2" w:char="00A3"/>
+      </w:r>
+      <w:r>
+        <w:rPr>
+          <w:rFonts w:ascii="Times New Roman" w:hAnsi="Times New Roman"/>
+          <w:color w:val="000000"/>
+          <w:sz w:val="26"/>
+          <w:szCs w:val="26"/>
+        </w:rPr>
+        <w:t xml:space="preserve"> Trung cấp</w:t>
+      </w:r>
+      <w:r>
+        <w:rPr>
+          <w:rFonts w:ascii="Times New Roman" w:hAnsi="Times New Roman"/>
+          <w:color w:val="000000"/>
+          <w:sz w:val="26"/>
+          <w:szCs w:val="26"/>
+        </w:rPr>
+        <w:tab/>
+      </w:r>
+      <w:r>
+        <w:rPr>
+          <w:rFonts w:ascii="Times New Roman" w:hAnsi="Times New Roman"/>
+          <w:color w:val="000000"/>
+          <w:sz w:val="26"/>
+          <w:szCs w:val="26"/>
+        </w:rPr>
+        <w:t xml:space="preserve">       </w:t>
       </w:r>
     </w:p>
     <w:p>
@@ -2784,8 +4833,74 @@
       <w:r>
         <w:rPr>
           <w:rFonts w:ascii="Times New Roman" w:hAnsi="Times New Roman"/>
-        </w:rPr>
-        <w:t xml:space="preserve">            {father_edu_ptth} Phổ thông trung học                       {father_edu_chuatn} Chưa tốt nghiệp PTTH</w:t>
+          <w:color w:val="000000"/>
+          <w:sz w:val="26"/>
+          <w:szCs w:val="26"/>
+        </w:rPr>
+        <w:t xml:space="preserve">           </w:t>
+      </w:r>
+      <w:r>
+        <w:rPr>
+          <w:rFonts w:ascii="Times New Roman" w:hAnsi="Times New Roman"/>
+          <w:color w:val="000000"/>
+          <w:sz w:val="26"/>
+          <w:szCs w:val="26"/>
+        </w:rPr>
+        <w:sym w:font="Wingdings 2" w:char="00A3"/>
+      </w:r>
+      <w:r>
+        <w:rPr>
+          <w:rFonts w:ascii="Times New Roman" w:hAnsi="Times New Roman"/>
+          <w:color w:val="000000"/>
+          <w:sz w:val="26"/>
+          <w:szCs w:val="26"/>
+        </w:rPr>
+        <w:t xml:space="preserve"> Phổ thông trung học</w:t>
+      </w:r>
+      <w:r>
+        <w:rPr>
+          <w:rFonts w:ascii="Times New Roman" w:hAnsi="Times New Roman"/>
+          <w:color w:val="000000"/>
+          <w:sz w:val="26"/>
+          <w:szCs w:val="26"/>
+        </w:rPr>
+        <w:t xml:space="preserve">  </w:t>
+      </w:r>
+      <w:r>
+        <w:rPr>
+          <w:rFonts w:ascii="Times New Roman" w:hAnsi="Times New Roman"/>
+          <w:color w:val="000000"/>
+          <w:sz w:val="26"/>
+          <w:szCs w:val="26"/>
+        </w:rPr>
+        <w:t xml:space="preserve">     </w:t>
+      </w:r>
+      <w:r>
+        <w:rPr>
+          <w:rFonts w:ascii="Times New Roman" w:hAnsi="Times New Roman"/>
+          <w:color w:val="000000"/>
+          <w:sz w:val="26"/>
+          <w:szCs w:val="26"/>
+        </w:rPr>
+        <w:t xml:space="preserve">                </w:t>
+      </w:r>
+      <w:r>
+        <w:rPr>
+          <w:rFonts w:ascii="Times New Roman" w:hAnsi="Times New Roman"/>
+          <w:color w:val="000000"/>
+          <w:sz w:val="26"/>
+          <w:szCs w:val="26"/>
+        </w:rPr>
+        <w:sym w:font="Wingdings 2" w:char="00A3"/>
+      </w:r>
+      <w:r>
+        <w:rPr>
+          <w:rFonts w:ascii="Times New Roman" w:hAnsi="Times New Roman"/>
+          <w:color w:val="000000"/>
+          <w:sz w:val="26"/>
+          <w:szCs w:val="26"/>
+        </w:rPr>
+        <w:t xml:space="preserve"> Chưa tốt nghiệp PTTH</w:t>
       </w:r>
     </w:p>
     <w:p>
@@ -2803,8 +4918,101 @@
       <w:r>
         <w:rPr>
           <w:rFonts w:ascii="Times New Roman" w:hAnsi="Times New Roman"/>
-        </w:rPr>
-        <w:t xml:space="preserve">- Họ và tên MẸ: {mother_name}  Ngày sinh: {mother_yob}</w:t>
+          <w:b/>
+          <w:color w:val="000000"/>
+          <w:sz w:val="26"/>
+          <w:szCs w:val="26"/>
+          <w:lang w:val="vi-VN"/>
+        </w:rPr>
+        <w:t xml:space="preserve">- Họ và tên </w:t>
+      </w:r>
+      <w:r>
+        <w:rPr>
+          <w:rFonts w:ascii="Times New Roman" w:hAnsi="Times New Roman"/>
+          <w:b/>
+          <w:color w:val="000000"/>
+          <w:sz w:val="26"/>
+          <w:szCs w:val="26"/>
+        </w:rPr>
+        <w:t>MẸ</w:t>
+      </w:r>
+      <w:r>
+        <w:rPr>
+          <w:rFonts w:ascii="Times New Roman" w:hAnsi="Times New Roman"/>
+          <w:color w:val="000000"/>
+          <w:sz w:val="26"/>
+          <w:szCs w:val="26"/>
+          <w:lang w:val="vi-VN"/>
+        </w:rPr>
+        <w:t>:.................................…….........................</w:t>
+      </w:r>
+      <w:r>
+        <w:rPr>
+          <w:rFonts w:ascii="Times New Roman" w:hAnsi="Times New Roman"/>
+          <w:color w:val="000000"/>
+          <w:sz w:val="26"/>
+          <w:szCs w:val="26"/>
+        </w:rPr>
+        <w:t>...........N</w:t>
+      </w:r>
+      <w:r>
+        <w:rPr>
+          <w:rFonts w:ascii="Times New Roman" w:hAnsi="Times New Roman"/>
+          <w:color w:val="000000"/>
+          <w:sz w:val="26"/>
+          <w:szCs w:val="26"/>
+          <w:lang w:val="vi-VN"/>
+        </w:rPr>
+        <w:t>gày</w:t>
+      </w:r>
+      <w:r>
+        <w:rPr>
+          <w:rFonts w:ascii="Times New Roman" w:hAnsi="Times New Roman"/>
+          <w:color w:val="000000"/>
+          <w:sz w:val="26"/>
+          <w:szCs w:val="26"/>
+        </w:rPr>
+        <w:t xml:space="preserve"> </w:t>
+      </w:r>
+      <w:proofErr w:type="gramStart"/>
+      <w:r>
+        <w:rPr>
+          <w:rFonts w:ascii="Times New Roman" w:hAnsi="Times New Roman"/>
+          <w:color w:val="000000"/>
+          <w:sz w:val="26"/>
+          <w:szCs w:val="26"/>
+        </w:rPr>
+        <w:t>sinh</w:t>
+      </w:r>
+      <w:r>
+        <w:rPr>
+          <w:rFonts w:ascii="Times New Roman" w:hAnsi="Times New Roman"/>
+          <w:color w:val="000000"/>
+          <w:sz w:val="26"/>
+          <w:szCs w:val="26"/>
+          <w:lang w:val="vi-VN"/>
+        </w:rPr>
+        <w:t>:........</w:t>
+      </w:r>
+      <w:proofErr w:type="gramEnd"/>
+      <w:r>
+        <w:rPr>
+          <w:rFonts w:ascii="Times New Roman" w:hAnsi="Times New Roman"/>
+          <w:color w:val="000000"/>
+          <w:sz w:val="26"/>
+          <w:szCs w:val="26"/>
+          <w:lang w:val="vi-VN"/>
+        </w:rPr>
+        <w:t>…...............</w:t>
+      </w:r>
+      <w:r>
+        <w:rPr>
+          <w:rFonts w:ascii="Times New Roman" w:hAnsi="Times New Roman"/>
+          <w:color w:val="000000"/>
+          <w:sz w:val="26"/>
+          <w:szCs w:val="26"/>
+        </w:rPr>
+        <w:t>............</w:t>
       </w:r>
     </w:p>
     <w:p>
@@ -2822,9 +5030,43 @@
       <w:r>
         <w:rPr>
           <w:rFonts w:ascii="Times New Roman" w:hAnsi="Times New Roman"/>
-        </w:rPr>
-        <w:t xml:space="preserve">- Địa chỉ thường trú: {mother_address}</w:t>
-      </w:r>
+          <w:color w:val="000000"/>
+          <w:sz w:val="26"/>
+          <w:szCs w:val="26"/>
+        </w:rPr>
+        <w:t xml:space="preserve">- </w:t>
+      </w:r>
+      <w:r>
+        <w:rPr>
+          <w:rFonts w:ascii="Times New Roman" w:hAnsi="Times New Roman"/>
+          <w:color w:val="000000"/>
+          <w:sz w:val="26"/>
+          <w:szCs w:val="26"/>
+          <w:lang w:val="vi-VN"/>
+        </w:rPr>
+        <w:t xml:space="preserve">Địa chỉ thường </w:t>
+      </w:r>
+      <w:proofErr w:type="gramStart"/>
+      <w:r>
+        <w:rPr>
+          <w:rFonts w:ascii="Times New Roman" w:hAnsi="Times New Roman"/>
+          <w:color w:val="000000"/>
+          <w:sz w:val="26"/>
+          <w:szCs w:val="26"/>
+          <w:lang w:val="vi-VN"/>
+        </w:rPr>
+        <w:t>trú:.........................................................</w:t>
+      </w:r>
+      <w:r>
+        <w:rPr>
+          <w:rFonts w:ascii="Times New Roman" w:hAnsi="Times New Roman"/>
+          <w:color w:val="000000"/>
+          <w:sz w:val="26"/>
+          <w:szCs w:val="26"/>
+        </w:rPr>
+        <w:t>.......................................................................</w:t>
+      </w:r>
+      <w:proofErr w:type="gramEnd"/>
     </w:p>
     <w:p>
       <w:pPr>
@@ -2841,8 +5083,90 @@
       <w:r>
         <w:rPr>
           <w:rFonts w:ascii="Times New Roman" w:hAnsi="Times New Roman"/>
-        </w:rPr>
-        <w:t xml:space="preserve">- Số điện thoại: {mother_phone}  Nghề nghiệp: {mother_job}</w:t>
+          <w:color w:val="000000"/>
+          <w:sz w:val="26"/>
+          <w:szCs w:val="26"/>
+        </w:rPr>
+        <w:t xml:space="preserve">- </w:t>
+      </w:r>
+      <w:r>
+        <w:rPr>
+          <w:rFonts w:ascii="Times New Roman" w:hAnsi="Times New Roman"/>
+          <w:color w:val="000000"/>
+          <w:sz w:val="26"/>
+          <w:szCs w:val="26"/>
+          <w:lang w:val="vi-VN"/>
+        </w:rPr>
+        <w:t xml:space="preserve">Số điện </w:t>
+      </w:r>
+      <w:proofErr w:type="gramStart"/>
+      <w:r>
+        <w:rPr>
+          <w:rFonts w:ascii="Times New Roman" w:hAnsi="Times New Roman"/>
+          <w:color w:val="000000"/>
+          <w:sz w:val="26"/>
+          <w:szCs w:val="26"/>
+          <w:lang w:val="vi-VN"/>
+        </w:rPr>
+        <w:t>thoại</w:t>
+      </w:r>
+      <w:r>
+        <w:rPr>
+          <w:rFonts w:ascii="Times New Roman" w:hAnsi="Times New Roman"/>
+          <w:color w:val="000000"/>
+          <w:sz w:val="26"/>
+          <w:szCs w:val="26"/>
+        </w:rPr>
+        <w:t>:</w:t>
+      </w:r>
+      <w:r>
+        <w:rPr>
+          <w:rFonts w:ascii="Times New Roman" w:hAnsi="Times New Roman"/>
+          <w:color w:val="000000"/>
+          <w:sz w:val="26"/>
+          <w:szCs w:val="26"/>
+          <w:lang w:val="vi-VN"/>
+        </w:rPr>
+        <w:t>…</w:t>
+      </w:r>
+      <w:proofErr w:type="gramEnd"/>
+      <w:r>
+        <w:rPr>
+          <w:rFonts w:ascii="Times New Roman" w:hAnsi="Times New Roman"/>
+          <w:color w:val="000000"/>
+          <w:sz w:val="26"/>
+          <w:szCs w:val="26"/>
+          <w:lang w:val="vi-VN"/>
+        </w:rPr>
+        <w:t>……………………</w:t>
+      </w:r>
+      <w:r>
+        <w:rPr>
+          <w:rFonts w:ascii="Times New Roman" w:hAnsi="Times New Roman"/>
+          <w:color w:val="000000"/>
+          <w:sz w:val="26"/>
+          <w:szCs w:val="26"/>
+        </w:rPr>
+        <w:t>…………….</w:t>
+      </w:r>
+      <w:r>
+        <w:rPr>
+          <w:rFonts w:ascii="Times New Roman" w:hAnsi="Times New Roman"/>
+          <w:color w:val="000000"/>
+          <w:sz w:val="26"/>
+          <w:szCs w:val="26"/>
+          <w:lang w:val="vi-VN"/>
+        </w:rPr>
+        <w:t>Nghề nghiệp:..............……......................</w:t>
+      </w:r>
+      <w:r>
+        <w:rPr>
+          <w:rFonts w:ascii="Times New Roman" w:hAnsi="Times New Roman"/>
+          <w:color w:val="000000"/>
+          <w:sz w:val="26"/>
+          <w:szCs w:val="26"/>
+        </w:rPr>
+        <w:t>.............</w:t>
       </w:r>
     </w:p>
     <w:p>
@@ -2859,8 +5183,111 @@
       <w:r>
         <w:rPr>
           <w:rFonts w:ascii="Times New Roman" w:hAnsi="Times New Roman"/>
-        </w:rPr>
-        <w:t xml:space="preserve">- Trình độ học vấn: {mother_edu_sdh} Sau đại học  {mother_edu_dh} Đại học  {mother_edu_cd} Cao đẳng  {mother_edu_tc} Trung cấp</w:t>
+          <w:color w:val="000000"/>
+          <w:sz w:val="26"/>
+          <w:szCs w:val="26"/>
+        </w:rPr>
+        <w:t xml:space="preserve">- Trình độ học vấn:  </w:t>
+      </w:r>
+      <w:r>
+        <w:rPr>
+          <w:rFonts w:ascii="Times New Roman" w:hAnsi="Times New Roman"/>
+          <w:color w:val="000000"/>
+          <w:sz w:val="26"/>
+          <w:szCs w:val="26"/>
+        </w:rPr>
+        <w:t xml:space="preserve"> </w:t>
+      </w:r>
+      <w:r>
+        <w:rPr>
+          <w:rFonts w:ascii="Times New Roman" w:hAnsi="Times New Roman"/>
+          <w:color w:val="000000"/>
+          <w:sz w:val="26"/>
+          <w:szCs w:val="26"/>
+        </w:rPr>
+        <w:sym w:font="Wingdings 2" w:char="00A3"/>
+      </w:r>
+      <w:r>
+        <w:rPr>
+          <w:rFonts w:ascii="Times New Roman" w:hAnsi="Times New Roman"/>
+          <w:color w:val="000000"/>
+          <w:sz w:val="26"/>
+          <w:szCs w:val="26"/>
+        </w:rPr>
+        <w:t xml:space="preserve"> Sau đại học </w:t>
+      </w:r>
+      <w:r>
+        <w:rPr>
+          <w:rFonts w:ascii="Times New Roman" w:hAnsi="Times New Roman"/>
+          <w:color w:val="000000"/>
+          <w:sz w:val="26"/>
+          <w:szCs w:val="26"/>
+        </w:rPr>
+        <w:tab/>
+      </w:r>
+      <w:r>
+        <w:rPr>
+          <w:rFonts w:ascii="Times New Roman" w:hAnsi="Times New Roman"/>
+          <w:color w:val="000000"/>
+          <w:sz w:val="26"/>
+          <w:szCs w:val="26"/>
+        </w:rPr>
+        <w:sym w:font="Wingdings 2" w:char="00A3"/>
+      </w:r>
+      <w:r>
+        <w:rPr>
+          <w:rFonts w:ascii="Times New Roman" w:hAnsi="Times New Roman"/>
+          <w:color w:val="000000"/>
+          <w:sz w:val="26"/>
+          <w:szCs w:val="26"/>
+        </w:rPr>
+        <w:t xml:space="preserve"> Đại học          </w:t>
+      </w:r>
+      <w:r>
+        <w:rPr>
+          <w:rFonts w:ascii="Times New Roman" w:hAnsi="Times New Roman"/>
+          <w:color w:val="000000"/>
+          <w:sz w:val="26"/>
+          <w:szCs w:val="26"/>
+        </w:rPr>
+        <w:sym w:font="Wingdings 2" w:char="00A3"/>
+      </w:r>
+      <w:r>
+        <w:rPr>
+          <w:rFonts w:ascii="Times New Roman" w:hAnsi="Times New Roman"/>
+          <w:color w:val="000000"/>
+          <w:sz w:val="26"/>
+          <w:szCs w:val="26"/>
+        </w:rPr>
+        <w:t xml:space="preserve"> Cao đẳng       </w:t>
+      </w:r>
+      <w:r>
+        <w:rPr>
+          <w:rFonts w:ascii="Times New Roman" w:hAnsi="Times New Roman"/>
+          <w:color w:val="000000"/>
+          <w:sz w:val="26"/>
+          <w:szCs w:val="26"/>
+        </w:rPr>
+        <w:sym w:font="Wingdings 2" w:char="00A3"/>
+      </w:r>
+      <w:r>
+        <w:rPr>
+          <w:rFonts w:ascii="Times New Roman" w:hAnsi="Times New Roman"/>
+          <w:color w:val="000000"/>
+          <w:sz w:val="26"/>
+          <w:szCs w:val="26"/>
+        </w:rPr>
+        <w:t xml:space="preserve"> Trung cấp</w:t>
+      </w:r>
+      <w:r>
+        <w:rPr>
+          <w:rFonts w:ascii="Times New Roman" w:hAnsi="Times New Roman"/>
+          <w:color w:val="000000"/>
+          <w:sz w:val="26"/>
+          <w:szCs w:val="26"/>
+        </w:rPr>
+        <w:tab/>
+        <w:t xml:space="preserve">       </w:t>
       </w:r>
     </w:p>
     <w:p>
@@ -2877,8 +5304,47 @@
       <w:r>
         <w:rPr>
           <w:rFonts w:ascii="Times New Roman" w:hAnsi="Times New Roman"/>
-        </w:rPr>
-        <w:t xml:space="preserve">            {mother_edu_ptth} Phổ thông trung học                       {mother_edu_chuatn} Chưa tốt nghiệp PTTH</w:t>
+          <w:color w:val="000000"/>
+          <w:sz w:val="26"/>
+          <w:szCs w:val="26"/>
+        </w:rPr>
+        <w:t xml:space="preserve">           </w:t>
+      </w:r>
+      <w:r>
+        <w:rPr>
+          <w:rFonts w:ascii="Times New Roman" w:hAnsi="Times New Roman"/>
+          <w:color w:val="000000"/>
+          <w:sz w:val="26"/>
+          <w:szCs w:val="26"/>
+        </w:rPr>
+        <w:sym w:font="Wingdings 2" w:char="00A3"/>
+      </w:r>
+      <w:r>
+        <w:rPr>
+          <w:rFonts w:ascii="Times New Roman" w:hAnsi="Times New Roman"/>
+          <w:color w:val="000000"/>
+          <w:sz w:val="26"/>
+          <w:szCs w:val="26"/>
+        </w:rPr>
+        <w:t xml:space="preserve"> Phổ thông trung học                       </w:t>
+      </w:r>
+      <w:r>
+        <w:rPr>
+          <w:rFonts w:ascii="Times New Roman" w:hAnsi="Times New Roman"/>
+          <w:color w:val="000000"/>
+          <w:sz w:val="26"/>
+          <w:szCs w:val="26"/>
+        </w:rPr>
+        <w:sym w:font="Wingdings 2" w:char="00A3"/>
+      </w:r>
+      <w:r>
+        <w:rPr>
+          <w:rFonts w:ascii="Times New Roman" w:hAnsi="Times New Roman"/>
+          <w:color w:val="000000"/>
+          <w:sz w:val="26"/>
+          <w:szCs w:val="26"/>
+        </w:rPr>
+        <w:t xml:space="preserve"> Chưa tốt nghiệp PTTH</w:t>
       </w:r>
     </w:p>
     <w:p>
@@ -2896,8 +5362,101 @@
       <w:r>
         <w:rPr>
           <w:rFonts w:ascii="Times New Roman" w:hAnsi="Times New Roman"/>
-        </w:rPr>
-        <w:t xml:space="preserve">- Họ và tên CHỒNG/VỢ: {spouse_name}  Ngày sinh: {spouse_yob}</w:t>
+          <w:b/>
+          <w:color w:val="000000"/>
+          <w:sz w:val="26"/>
+          <w:szCs w:val="26"/>
+          <w:lang w:val="vi-VN"/>
+        </w:rPr>
+        <w:t xml:space="preserve">- Họ và tên </w:t>
+      </w:r>
+      <w:r>
+        <w:rPr>
+          <w:rFonts w:ascii="Times New Roman" w:hAnsi="Times New Roman"/>
+          <w:b/>
+          <w:color w:val="000000"/>
+          <w:sz w:val="26"/>
+          <w:szCs w:val="26"/>
+        </w:rPr>
+        <w:t>CHỒNG/VỢ</w:t>
+      </w:r>
+      <w:r>
+        <w:rPr>
+          <w:rFonts w:ascii="Times New Roman" w:hAnsi="Times New Roman"/>
+          <w:color w:val="000000"/>
+          <w:sz w:val="26"/>
+          <w:szCs w:val="26"/>
+          <w:lang w:val="vi-VN"/>
+        </w:rPr>
+        <w:t>:....................…….........................</w:t>
+      </w:r>
+      <w:r>
+        <w:rPr>
+          <w:rFonts w:ascii="Times New Roman" w:hAnsi="Times New Roman"/>
+          <w:color w:val="000000"/>
+          <w:sz w:val="26"/>
+          <w:szCs w:val="26"/>
+        </w:rPr>
+        <w:t>......................N</w:t>
+      </w:r>
+      <w:r>
+        <w:rPr>
+          <w:rFonts w:ascii="Times New Roman" w:hAnsi="Times New Roman"/>
+          <w:color w:val="000000"/>
+          <w:sz w:val="26"/>
+          <w:szCs w:val="26"/>
+          <w:lang w:val="vi-VN"/>
+        </w:rPr>
+        <w:t>gày</w:t>
+      </w:r>
+      <w:r>
+        <w:rPr>
+          <w:rFonts w:ascii="Times New Roman" w:hAnsi="Times New Roman"/>
+          <w:color w:val="000000"/>
+          <w:sz w:val="26"/>
+          <w:szCs w:val="26"/>
+        </w:rPr>
+        <w:t xml:space="preserve"> </w:t>
+      </w:r>
+      <w:proofErr w:type="gramStart"/>
+      <w:r>
+        <w:rPr>
+          <w:rFonts w:ascii="Times New Roman" w:hAnsi="Times New Roman"/>
+          <w:color w:val="000000"/>
+          <w:sz w:val="26"/>
+          <w:szCs w:val="26"/>
+        </w:rPr>
+        <w:t>sinh</w:t>
+      </w:r>
+      <w:r>
+        <w:rPr>
+          <w:rFonts w:ascii="Times New Roman" w:hAnsi="Times New Roman"/>
+          <w:color w:val="000000"/>
+          <w:sz w:val="26"/>
+          <w:szCs w:val="26"/>
+          <w:lang w:val="vi-VN"/>
+        </w:rPr>
+        <w:t>:........</w:t>
+      </w:r>
+      <w:proofErr w:type="gramEnd"/>
+      <w:r>
+        <w:rPr>
+          <w:rFonts w:ascii="Times New Roman" w:hAnsi="Times New Roman"/>
+          <w:color w:val="000000"/>
+          <w:sz w:val="26"/>
+          <w:szCs w:val="26"/>
+          <w:lang w:val="vi-VN"/>
+        </w:rPr>
+        <w:t>…............</w:t>
+      </w:r>
+      <w:r>
+        <w:rPr>
+          <w:rFonts w:ascii="Times New Roman" w:hAnsi="Times New Roman"/>
+          <w:color w:val="000000"/>
+          <w:sz w:val="26"/>
+          <w:szCs w:val="26"/>
+        </w:rPr>
+        <w:t>..</w:t>
       </w:r>
     </w:p>
     <w:p>
@@ -2915,9 +5474,43 @@
       <w:r>
         <w:rPr>
           <w:rFonts w:ascii="Times New Roman" w:hAnsi="Times New Roman"/>
-        </w:rPr>
-        <w:t xml:space="preserve">- Địa chỉ thường trú: {spouse_address}</w:t>
-      </w:r>
+          <w:color w:val="000000"/>
+          <w:sz w:val="26"/>
+          <w:szCs w:val="26"/>
+        </w:rPr>
+        <w:t xml:space="preserve">- </w:t>
+      </w:r>
+      <w:r>
+        <w:rPr>
+          <w:rFonts w:ascii="Times New Roman" w:hAnsi="Times New Roman"/>
+          <w:color w:val="000000"/>
+          <w:sz w:val="26"/>
+          <w:szCs w:val="26"/>
+          <w:lang w:val="vi-VN"/>
+        </w:rPr>
+        <w:t xml:space="preserve">Địa chỉ thường </w:t>
+      </w:r>
+      <w:proofErr w:type="gramStart"/>
+      <w:r>
+        <w:rPr>
+          <w:rFonts w:ascii="Times New Roman" w:hAnsi="Times New Roman"/>
+          <w:color w:val="000000"/>
+          <w:sz w:val="26"/>
+          <w:szCs w:val="26"/>
+          <w:lang w:val="vi-VN"/>
+        </w:rPr>
+        <w:t>trú:.........................................................</w:t>
+      </w:r>
+      <w:r>
+        <w:rPr>
+          <w:rFonts w:ascii="Times New Roman" w:hAnsi="Times New Roman"/>
+          <w:color w:val="000000"/>
+          <w:sz w:val="26"/>
+          <w:szCs w:val="26"/>
+        </w:rPr>
+        <w:t>.......................................................................</w:t>
+      </w:r>
+      <w:proofErr w:type="gramEnd"/>
     </w:p>
     <w:p>
       <w:pPr>
@@ -2934,8 +5527,90 @@
       <w:r>
         <w:rPr>
           <w:rFonts w:ascii="Times New Roman" w:hAnsi="Times New Roman"/>
-        </w:rPr>
-        <w:t xml:space="preserve">- Số điện thoại: {spouse_phone}  Nghề nghiệp: {spouse_job}</w:t>
+          <w:color w:val="000000"/>
+          <w:sz w:val="26"/>
+          <w:szCs w:val="26"/>
+        </w:rPr>
+        <w:t xml:space="preserve">- </w:t>
+      </w:r>
+      <w:r>
+        <w:rPr>
+          <w:rFonts w:ascii="Times New Roman" w:hAnsi="Times New Roman"/>
+          <w:color w:val="000000"/>
+          <w:sz w:val="26"/>
+          <w:szCs w:val="26"/>
+          <w:lang w:val="vi-VN"/>
+        </w:rPr>
+        <w:t xml:space="preserve">Số điện </w:t>
+      </w:r>
+      <w:proofErr w:type="gramStart"/>
+      <w:r>
+        <w:rPr>
+          <w:rFonts w:ascii="Times New Roman" w:hAnsi="Times New Roman"/>
+          <w:color w:val="000000"/>
+          <w:sz w:val="26"/>
+          <w:szCs w:val="26"/>
+          <w:lang w:val="vi-VN"/>
+        </w:rPr>
+        <w:t>thoại</w:t>
+      </w:r>
+      <w:r>
+        <w:rPr>
+          <w:rFonts w:ascii="Times New Roman" w:hAnsi="Times New Roman"/>
+          <w:color w:val="000000"/>
+          <w:sz w:val="26"/>
+          <w:szCs w:val="26"/>
+        </w:rPr>
+        <w:t>:</w:t>
+      </w:r>
+      <w:r>
+        <w:rPr>
+          <w:rFonts w:ascii="Times New Roman" w:hAnsi="Times New Roman"/>
+          <w:color w:val="000000"/>
+          <w:sz w:val="26"/>
+          <w:szCs w:val="26"/>
+          <w:lang w:val="vi-VN"/>
+        </w:rPr>
+        <w:t>…</w:t>
+      </w:r>
+      <w:proofErr w:type="gramEnd"/>
+      <w:r>
+        <w:rPr>
+          <w:rFonts w:ascii="Times New Roman" w:hAnsi="Times New Roman"/>
+          <w:color w:val="000000"/>
+          <w:sz w:val="26"/>
+          <w:szCs w:val="26"/>
+          <w:lang w:val="vi-VN"/>
+        </w:rPr>
+        <w:t>……………………</w:t>
+      </w:r>
+      <w:r>
+        <w:rPr>
+          <w:rFonts w:ascii="Times New Roman" w:hAnsi="Times New Roman"/>
+          <w:color w:val="000000"/>
+          <w:sz w:val="26"/>
+          <w:szCs w:val="26"/>
+        </w:rPr>
+        <w:t>…………….</w:t>
+      </w:r>
+      <w:r>
+        <w:rPr>
+          <w:rFonts w:ascii="Times New Roman" w:hAnsi="Times New Roman"/>
+          <w:color w:val="000000"/>
+          <w:sz w:val="26"/>
+          <w:szCs w:val="26"/>
+          <w:lang w:val="vi-VN"/>
+        </w:rPr>
+        <w:t>Nghề nghiệp:..............……......................</w:t>
+      </w:r>
+      <w:r>
+        <w:rPr>
+          <w:rFonts w:ascii="Times New Roman" w:hAnsi="Times New Roman"/>
+          <w:color w:val="000000"/>
+          <w:sz w:val="26"/>
+          <w:szCs w:val="26"/>
+        </w:rPr>
+        <w:t>..............</w:t>
       </w:r>
     </w:p>
     <w:p>
@@ -2952,8 +5627,111 @@
       <w:r>
         <w:rPr>
           <w:rFonts w:ascii="Times New Roman" w:hAnsi="Times New Roman"/>
-        </w:rPr>
-        <w:t xml:space="preserve">- Trình độ học vấn: {spouse_edu_sdh} Sau đại học  {spouse_edu_dh} Đại học  {spouse_edu_cd} Cao đẳng  {spouse_edu_tc} Trung cấp</w:t>
+          <w:color w:val="000000"/>
+          <w:sz w:val="26"/>
+          <w:szCs w:val="26"/>
+        </w:rPr>
+        <w:t xml:space="preserve">- Trình độ học vấn:  </w:t>
+      </w:r>
+      <w:r>
+        <w:rPr>
+          <w:rFonts w:ascii="Times New Roman" w:hAnsi="Times New Roman"/>
+          <w:color w:val="000000"/>
+          <w:sz w:val="26"/>
+          <w:szCs w:val="26"/>
+        </w:rPr>
+        <w:t xml:space="preserve"> </w:t>
+      </w:r>
+      <w:r>
+        <w:rPr>
+          <w:rFonts w:ascii="Times New Roman" w:hAnsi="Times New Roman"/>
+          <w:color w:val="000000"/>
+          <w:sz w:val="26"/>
+          <w:szCs w:val="26"/>
+        </w:rPr>
+        <w:sym w:font="Wingdings 2" w:char="00A3"/>
+      </w:r>
+      <w:r>
+        <w:rPr>
+          <w:rFonts w:ascii="Times New Roman" w:hAnsi="Times New Roman"/>
+          <w:color w:val="000000"/>
+          <w:sz w:val="26"/>
+          <w:szCs w:val="26"/>
+        </w:rPr>
+        <w:t xml:space="preserve"> Sau đại học </w:t>
+      </w:r>
+      <w:r>
+        <w:rPr>
+          <w:rFonts w:ascii="Times New Roman" w:hAnsi="Times New Roman"/>
+          <w:color w:val="000000"/>
+          <w:sz w:val="26"/>
+          <w:szCs w:val="26"/>
+        </w:rPr>
+        <w:tab/>
+      </w:r>
+      <w:r>
+        <w:rPr>
+          <w:rFonts w:ascii="Times New Roman" w:hAnsi="Times New Roman"/>
+          <w:color w:val="000000"/>
+          <w:sz w:val="26"/>
+          <w:szCs w:val="26"/>
+        </w:rPr>
+        <w:sym w:font="Wingdings 2" w:char="00A3"/>
+      </w:r>
+      <w:r>
+        <w:rPr>
+          <w:rFonts w:ascii="Times New Roman" w:hAnsi="Times New Roman"/>
+          <w:color w:val="000000"/>
+          <w:sz w:val="26"/>
+          <w:szCs w:val="26"/>
+        </w:rPr>
+        <w:t xml:space="preserve"> Đại học          </w:t>
+      </w:r>
+      <w:r>
+        <w:rPr>
+          <w:rFonts w:ascii="Times New Roman" w:hAnsi="Times New Roman"/>
+          <w:color w:val="000000"/>
+          <w:sz w:val="26"/>
+          <w:szCs w:val="26"/>
+        </w:rPr>
+        <w:sym w:font="Wingdings 2" w:char="00A3"/>
+      </w:r>
+      <w:r>
+        <w:rPr>
+          <w:rFonts w:ascii="Times New Roman" w:hAnsi="Times New Roman"/>
+          <w:color w:val="000000"/>
+          <w:sz w:val="26"/>
+          <w:szCs w:val="26"/>
+        </w:rPr>
+        <w:t xml:space="preserve"> Cao đẳng       </w:t>
+      </w:r>
+      <w:r>
+        <w:rPr>
+          <w:rFonts w:ascii="Times New Roman" w:hAnsi="Times New Roman"/>
+          <w:color w:val="000000"/>
+          <w:sz w:val="26"/>
+          <w:szCs w:val="26"/>
+        </w:rPr>
+        <w:sym w:font="Wingdings 2" w:char="00A3"/>
+      </w:r>
+      <w:r>
+        <w:rPr>
+          <w:rFonts w:ascii="Times New Roman" w:hAnsi="Times New Roman"/>
+          <w:color w:val="000000"/>
+          <w:sz w:val="26"/>
+          <w:szCs w:val="26"/>
+        </w:rPr>
+        <w:t xml:space="preserve"> Trung cấp</w:t>
+      </w:r>
+      <w:r>
+        <w:rPr>
+          <w:rFonts w:ascii="Times New Roman" w:hAnsi="Times New Roman"/>
+          <w:color w:val="000000"/>
+          <w:sz w:val="26"/>
+          <w:szCs w:val="26"/>
+        </w:rPr>
+        <w:tab/>
+        <w:t xml:space="preserve">       </w:t>
       </w:r>
     </w:p>
     <w:p>
@@ -2970,8 +5748,47 @@
       <w:r>
         <w:rPr>
           <w:rFonts w:ascii="Times New Roman" w:hAnsi="Times New Roman"/>
-        </w:rPr>
-        <w:t xml:space="preserve">            {spouse_edu_ptth} Phổ thông trung học                       {spouse_edu_chuatn} Chưa tốt nghiệp PTTH</w:t>
+          <w:color w:val="000000"/>
+          <w:sz w:val="26"/>
+          <w:szCs w:val="26"/>
+        </w:rPr>
+        <w:t xml:space="preserve">           </w:t>
+      </w:r>
+      <w:r>
+        <w:rPr>
+          <w:rFonts w:ascii="Times New Roman" w:hAnsi="Times New Roman"/>
+          <w:color w:val="000000"/>
+          <w:sz w:val="26"/>
+          <w:szCs w:val="26"/>
+        </w:rPr>
+        <w:sym w:font="Wingdings 2" w:char="00A3"/>
+      </w:r>
+      <w:r>
+        <w:rPr>
+          <w:rFonts w:ascii="Times New Roman" w:hAnsi="Times New Roman"/>
+          <w:color w:val="000000"/>
+          <w:sz w:val="26"/>
+          <w:szCs w:val="26"/>
+        </w:rPr>
+        <w:t xml:space="preserve"> Phổ thông trung học                       </w:t>
+      </w:r>
+      <w:r>
+        <w:rPr>
+          <w:rFonts w:ascii="Times New Roman" w:hAnsi="Times New Roman"/>
+          <w:color w:val="000000"/>
+          <w:sz w:val="26"/>
+          <w:szCs w:val="26"/>
+        </w:rPr>
+        <w:sym w:font="Wingdings 2" w:char="00A3"/>
+      </w:r>
+      <w:r>
+        <w:rPr>
+          <w:rFonts w:ascii="Times New Roman" w:hAnsi="Times New Roman"/>
+          <w:color w:val="000000"/>
+          <w:sz w:val="26"/>
+          <w:szCs w:val="26"/>
+        </w:rPr>
+        <w:t xml:space="preserve"> Chưa tốt nghiệp PTTH</w:t>
       </w:r>
     </w:p>
     <w:p>
@@ -3144,11 +5961,38 @@
                 <w:szCs w:val="26"/>
               </w:rPr>
             </w:pPr>
+            <w:proofErr w:type="gramStart"/>
             <w:r>
               <w:rPr>
                 <w:rFonts w:ascii="Times New Roman" w:hAnsi="Times New Roman"/>
-              </w:rPr>
-              <w:t xml:space="preserve">{footer_date}</w:t>
+                <w:i/>
+                <w:color w:val="000000"/>
+                <w:sz w:val="26"/>
+                <w:szCs w:val="26"/>
+              </w:rPr>
+              <w:t>…..</w:t>
+            </w:r>
+            <w:proofErr w:type="gramEnd"/>
+            <w:r>
+              <w:rPr>
+                <w:rFonts w:ascii="Times New Roman" w:hAnsi="Times New Roman"/>
+                <w:i/>
+                <w:color w:val="000000"/>
+                <w:sz w:val="26"/>
+                <w:szCs w:val="26"/>
+                <w:lang w:val="vi-VN"/>
+              </w:rPr>
+              <w:t>………......, ngày .......... tháng …... năm 20...</w:t>
+            </w:r>
+            <w:r>
+              <w:rPr>
+                <w:rFonts w:ascii="Times New Roman" w:hAnsi="Times New Roman"/>
+                <w:i/>
+                <w:color w:val="000000"/>
+                <w:sz w:val="26"/>
+                <w:szCs w:val="26"/>
+              </w:rPr>
+              <w:t>..</w:t>
             </w:r>
           </w:p>
           <w:p>
@@ -3169,8 +6013,14 @@
             <w:r>
               <w:rPr>
                 <w:rFonts w:ascii="Times New Roman" w:hAnsi="Times New Roman"/>
-              </w:rPr>
-              <w:t xml:space="preserve">Ký tên</w:t>
+                <w:b/>
+                <w:bCs/>
+                <w:color w:val="000000"/>
+                <w:sz w:val="26"/>
+                <w:szCs w:val="26"/>
+                <w:lang w:val="vi-VN"/>
+              </w:rPr>
+              <w:t>Ký tên</w:t>
             </w:r>
           </w:p>
           <w:p>
@@ -3189,8 +6039,12 @@
             <w:r>
               <w:rPr>
                 <w:rFonts w:ascii="Times New Roman" w:hAnsi="Times New Roman"/>
-              </w:rPr>
-              <w:t xml:space="preserve">(Ký và ghi rõ họ tên){footer_sig_dots}</w:t>
+                <w:bCs/>
+                <w:color w:val="000000"/>
+                <w:sz w:val="26"/>
+                <w:szCs w:val="26"/>
+              </w:rPr>
+              <w:t>(Ký và ghi rõ họ tên)</w:t>
             </w:r>
           </w:p>
           <w:p>
@@ -3333,9 +6187,9 @@
       <w:bookmarkEnd w:id="1"/>
     </w:p>
     <w:sectPr>
-      <w:headerReference w:type="even" ns9:id="rId8"/>
-      <w:footerReference w:type="even" ns9:id="rId9"/>
-      <w:footerReference w:type="default" ns9:id="rId10"/>
+      <w:headerReference w:type="even" r:id="rId8"/>
+      <w:footerReference w:type="even" r:id="rId9"/>
+      <w:footerReference w:type="default" r:id="rId10"/>
       <w:pgSz w:w="11907" w:h="16840"/>
       <w:pgMar w:top="567" w:right="567" w:bottom="426" w:left="567" w:header="720" w:footer="720" w:gutter="0"/>
       <w:paperSrc w:first="1" w:other="1"/>

</xml_diff>